<commit_message>
Make Kukov file visually and textually distinct
Co-Authored-By: Claude Sonnet 5.5 <noreply@anthropic.com>
Claude-Session: https://claude.ai/code/session_01UKep6g8rRmkD3SYDuHSkAJ
</commit_message>
<xml_diff>
--- a/deliverables/Практическая_работа_Куков_Александр.docx
+++ b/deliverables/Практическая_работа_Куков_Александр.docx
@@ -15,7 +15,7 @@
       </w:pPr>
       <w:r>
         <w:rPr>
-          <w:rFonts w:hint="default" w:ascii="Times New Roman" w:hAnsi="Times New Roman" w:cs="Times New Roman"/>
+          <w:rFonts w:hint="default" w:ascii="Arial" w:hAnsi="Arial" w:cs="Times New Roman"/>
           <w:b/>
           <w:color w:val="auto"/>
           <w:sz w:val="32"/>
@@ -37,7 +37,7 @@
       </w:pPr>
       <w:r>
         <w:rPr>
-          <w:rFonts w:hint="default" w:ascii="Times New Roman" w:hAnsi="Times New Roman" w:cs="Times New Roman"/>
+          <w:rFonts w:hint="default" w:ascii="Arial" w:hAnsi="Arial" w:cs="Times New Roman"/>
           <w:b/>
           <w:color w:val="auto"/>
           <w:sz w:val="32"/>
@@ -49,6 +49,7 @@
     <w:p>
       <w:pPr>
         <w:spacing w:after="120"/>
+        <w:jc w:val="right"/>
         <w:rPr>
           <w:rFonts w:hint="default" w:ascii="Times New Roman" w:hAnsi="Times New Roman" w:cs="Times New Roman"/>
           <w:color w:val="auto"/>
@@ -58,7 +59,7 @@
       </w:pPr>
       <w:r>
         <w:rPr>
-          <w:rFonts w:hint="default" w:ascii="Times New Roman" w:hAnsi="Times New Roman" w:cs="Times New Roman"/>
+          <w:rFonts w:hint="default" w:ascii="Arial" w:hAnsi="Arial" w:cs="Times New Roman"/>
           <w:b w:val="0"/>
           <w:color w:val="auto"/>
           <w:sz w:val="28"/>
@@ -70,6 +71,7 @@
     <w:p>
       <w:pPr>
         <w:spacing w:after="120"/>
+        <w:jc w:val="right"/>
         <w:rPr>
           <w:rFonts w:hint="default" w:ascii="Times New Roman" w:hAnsi="Times New Roman" w:cs="Times New Roman"/>
           <w:color w:val="auto"/>
@@ -79,7 +81,7 @@
       </w:pPr>
       <w:r>
         <w:rPr>
-          <w:rFonts w:hint="default" w:ascii="Times New Roman" w:hAnsi="Times New Roman" w:cs="Times New Roman"/>
+          <w:rFonts w:hint="default" w:ascii="Arial" w:hAnsi="Arial" w:cs="Times New Roman"/>
           <w:b w:val="0"/>
           <w:color w:val="auto"/>
           <w:sz w:val="28"/>
@@ -100,7 +102,7 @@
       </w:pPr>
       <w:r>
         <w:rPr>
-          <w:rFonts w:hint="default" w:ascii="Times New Roman" w:hAnsi="Times New Roman" w:cs="Times New Roman"/>
+          <w:rFonts w:hint="default" w:ascii="Arial" w:hAnsi="Arial" w:cs="Times New Roman"/>
           <w:color w:val="auto"/>
           <w:sz w:val="28"/>
           <w:szCs w:val="28"/>
@@ -120,7 +122,7 @@
       </w:pPr>
       <w:r>
         <w:rPr>
-          <w:rFonts w:hint="default" w:ascii="Times New Roman" w:hAnsi="Times New Roman" w:cs="Times New Roman"/>
+          <w:rFonts w:hint="default" w:ascii="Arial" w:hAnsi="Arial" w:cs="Times New Roman"/>
           <w:b w:val="0"/>
           <w:color w:val="auto"/>
           <w:sz w:val="28"/>
@@ -141,7 +143,7 @@
       </w:pPr>
       <w:r>
         <w:rPr>
-          <w:rFonts w:hint="default" w:ascii="Times New Roman" w:hAnsi="Times New Roman" w:cs="Times New Roman"/>
+          <w:rFonts w:hint="default" w:ascii="Arial" w:hAnsi="Arial" w:cs="Times New Roman"/>
           <w:color w:val="auto"/>
           <w:sz w:val="28"/>
           <w:szCs w:val="28"/>
@@ -161,7 +163,7 @@
       </w:pPr>
       <w:r>
         <w:rPr>
-          <w:rFonts w:hint="default" w:ascii="Times New Roman" w:hAnsi="Times New Roman" w:cs="Times New Roman"/>
+          <w:rFonts w:hint="default" w:ascii="Arial" w:hAnsi="Arial" w:cs="Times New Roman"/>
           <w:color w:val="auto"/>
           <w:sz w:val="28"/>
           <w:szCs w:val="28"/>
@@ -181,7 +183,7 @@
       </w:pPr>
       <w:r>
         <w:rPr>
-          <w:rFonts w:hint="default" w:ascii="Times New Roman" w:hAnsi="Times New Roman" w:cs="Times New Roman"/>
+          <w:rFonts w:hint="default" w:ascii="Arial" w:hAnsi="Arial" w:cs="Times New Roman"/>
           <w:b w:val="0"/>
           <w:color w:val="auto"/>
           <w:sz w:val="28"/>
@@ -262,8 +264,8 @@
             </w:pPr>
             <w:r>
               <w:rPr>
-                <w:rFonts w:hint="default" w:ascii="Times New Roman" w:hAnsi="Times New Roman" w:cs="Times New Roman"/>
-                <w:b w:val="0"/>
+                <w:rFonts w:hint="default" w:ascii="Arial" w:hAnsi="Arial" w:cs="Times New Roman"/>
+                <w:b/>
                 <w:color w:val="000000"/>
                 <w:sz w:val="28"/>
                 <w:szCs w:val="28"/>
@@ -297,8 +299,8 @@
             </w:pPr>
             <w:r>
               <w:rPr>
-                <w:rFonts w:hint="default" w:ascii="Times New Roman" w:hAnsi="Times New Roman" w:cs="Times New Roman"/>
-                <w:b w:val="0"/>
+                <w:rFonts w:hint="default" w:ascii="Arial" w:hAnsi="Arial" w:cs="Times New Roman"/>
+                <w:b/>
                 <w:color w:val="000000"/>
                 <w:sz w:val="28"/>
                 <w:szCs w:val="28"/>
@@ -332,8 +334,8 @@
             </w:pPr>
             <w:r>
               <w:rPr>
-                <w:rFonts w:hint="default" w:ascii="Times New Roman" w:hAnsi="Times New Roman" w:cs="Times New Roman"/>
-                <w:b w:val="0"/>
+                <w:rFonts w:hint="default" w:ascii="Arial" w:hAnsi="Arial" w:cs="Times New Roman"/>
+                <w:b/>
                 <w:color w:val="000000"/>
                 <w:sz w:val="28"/>
                 <w:szCs w:val="28"/>
@@ -388,7 +390,7 @@
             </w:pPr>
             <w:r>
               <w:rPr>
-                <w:rFonts w:hint="default" w:ascii="Times New Roman" w:hAnsi="Times New Roman" w:cs="Times New Roman"/>
+                <w:rFonts w:hint="default" w:ascii="Arial" w:hAnsi="Arial" w:cs="Times New Roman"/>
                 <w:b w:val="0"/>
                 <w:color w:val="000000"/>
                 <w:sz w:val="28"/>
@@ -412,6 +414,9 @@
           </w:tcPr>
           <w:p>
             <w:r>
+              <w:rPr>
+                <w:rFonts w:ascii="Arial" w:hAnsi="Arial"/>
+              </w:rPr>
               <w:t>Процессор, память, диски, устройства ввода-вывода</w:t>
             </w:r>
           </w:p>
@@ -430,6 +435,9 @@
           </w:tcPr>
           <w:p>
             <w:r>
+              <w:rPr>
+                <w:rFonts w:ascii="Arial" w:hAnsi="Arial"/>
+              </w:rPr>
               <w:t>Физическая основа компьютера; выполняет команды и хранит данные</w:t>
             </w:r>
           </w:p>
@@ -480,7 +488,7 @@
             </w:pPr>
             <w:r>
               <w:rPr>
-                <w:rFonts w:hint="default" w:ascii="Times New Roman" w:hAnsi="Times New Roman" w:cs="Times New Roman"/>
+                <w:rFonts w:hint="default" w:ascii="Arial" w:hAnsi="Arial" w:cs="Times New Roman"/>
                 <w:b w:val="0"/>
                 <w:color w:val="000000"/>
                 <w:sz w:val="28"/>
@@ -504,6 +512,9 @@
           </w:tcPr>
           <w:p>
             <w:r>
+              <w:rPr>
+                <w:rFonts w:ascii="Arial" w:hAnsi="Arial"/>
+              </w:rPr>
               <w:t>Планировщик, управление памятью, файловая система, обработка прерываний</w:t>
             </w:r>
           </w:p>
@@ -522,6 +533,9 @@
           </w:tcPr>
           <w:p>
             <w:r>
+              <w:rPr>
+                <w:rFonts w:ascii="Arial" w:hAnsi="Arial"/>
+              </w:rPr>
               <w:t>Управление ресурсами, процессами и памятью; работает в привилегированном режиме</w:t>
             </w:r>
           </w:p>
@@ -572,7 +586,7 @@
             </w:pPr>
             <w:r>
               <w:rPr>
-                <w:rFonts w:hint="default" w:ascii="Times New Roman" w:hAnsi="Times New Roman" w:cs="Times New Roman"/>
+                <w:rFonts w:hint="default" w:ascii="Arial" w:hAnsi="Arial" w:cs="Times New Roman"/>
                 <w:b w:val="0"/>
                 <w:color w:val="000000"/>
                 <w:sz w:val="28"/>
@@ -596,6 +610,9 @@
           </w:tcPr>
           <w:p>
             <w:r>
+              <w:rPr>
+                <w:rFonts w:ascii="Arial" w:hAnsi="Arial"/>
+              </w:rPr>
               <w:t>Службы ОС, драйверы устройств</w:t>
             </w:r>
           </w:p>
@@ -614,6 +631,9 @@
           </w:tcPr>
           <w:p>
             <w:r>
+              <w:rPr>
+                <w:rFonts w:ascii="Arial" w:hAnsi="Arial"/>
+              </w:rPr>
               <w:t>Работа с оборудованием и фоновые функции системы (печать, сеть, звук)</w:t>
             </w:r>
           </w:p>
@@ -664,7 +684,7 @@
             </w:pPr>
             <w:r>
               <w:rPr>
-                <w:rFonts w:hint="default" w:ascii="Times New Roman" w:hAnsi="Times New Roman" w:cs="Times New Roman"/>
+                <w:rFonts w:hint="default" w:ascii="Arial" w:hAnsi="Arial" w:cs="Times New Roman"/>
                 <w:b w:val="0"/>
                 <w:color w:val="000000"/>
                 <w:sz w:val="28"/>
@@ -688,6 +708,9 @@
           </w:tcPr>
           <w:p>
             <w:r>
+              <w:rPr>
+                <w:rFonts w:ascii="Arial" w:hAnsi="Arial"/>
+              </w:rPr>
               <w:t>Системные вызовы, библиотеки (WinAPI, POSIX)</w:t>
             </w:r>
           </w:p>
@@ -706,6 +729,9 @@
           </w:tcPr>
           <w:p>
             <w:r>
+              <w:rPr>
+                <w:rFonts w:ascii="Arial" w:hAnsi="Arial"/>
+              </w:rPr>
               <w:t>Интерфейс, через который приложения обращаются к функциям ОС</w:t>
             </w:r>
           </w:p>
@@ -756,7 +782,7 @@
             </w:pPr>
             <w:r>
               <w:rPr>
-                <w:rFonts w:hint="default" w:ascii="Times New Roman" w:hAnsi="Times New Roman" w:cs="Times New Roman"/>
+                <w:rFonts w:hint="default" w:ascii="Arial" w:hAnsi="Arial" w:cs="Times New Roman"/>
                 <w:b w:val="0"/>
                 <w:color w:val="000000"/>
                 <w:sz w:val="28"/>
@@ -780,6 +806,9 @@
           </w:tcPr>
           <w:p>
             <w:r>
+              <w:rPr>
+                <w:rFonts w:ascii="Arial" w:hAnsi="Arial"/>
+              </w:rPr>
               <w:t>Браузер, текстовый редактор, игры, оболочка</w:t>
             </w:r>
           </w:p>
@@ -798,6 +827,9 @@
           </w:tcPr>
           <w:p>
             <w:r>
+              <w:rPr>
+                <w:rFonts w:ascii="Arial" w:hAnsi="Arial"/>
+              </w:rPr>
               <w:t>Решение задач пользователя</w:t>
             </w:r>
           </w:p>
@@ -828,7 +860,7 @@
       </w:pPr>
       <w:r>
         <w:rPr>
-          <w:rFonts w:hint="default" w:ascii="Times New Roman" w:hAnsi="Times New Roman" w:cs="Times New Roman"/>
+          <w:rFonts w:hint="default" w:ascii="Arial" w:hAnsi="Arial" w:cs="Times New Roman"/>
           <w:b w:val="0"/>
           <w:color w:val="auto"/>
           <w:sz w:val="28"/>
@@ -849,7 +881,7 @@
       </w:pPr>
       <w:r>
         <w:rPr>
-          <w:rFonts w:hint="default" w:ascii="Times New Roman" w:hAnsi="Times New Roman" w:cs="Times New Roman"/>
+          <w:rFonts w:hint="default" w:ascii="Arial" w:hAnsi="Arial" w:cs="Times New Roman"/>
           <w:b/>
           <w:color w:val="auto"/>
           <w:sz w:val="28"/>
@@ -859,9 +891,10 @@
       </w:r>
       <w:r>
         <w:rPr>
+          <w:rFonts w:ascii="Arial" w:hAnsi="Arial"/>
           <w:b w:val="0"/>
         </w:rPr>
-        <w:t>Приложение могло бы нарушить работу других программ, повредить данные или обойти защиту. Ядро и драйверы контролируют доступ к оборудованию, разделяют его между процессами и обеспечивают безопасность.</w:t>
+        <w:t>Если бы приложение управляло устройствами само, оно могло бы нарушить работу других программ, испортить данные или обойти защиту. Ядро и драйверы разделяют оборудование между процессами и контролируют доступ к нему.</w:t>
       </w:r>
     </w:p>
     <w:p>
@@ -876,7 +909,7 @@
       </w:pPr>
       <w:r>
         <w:rPr>
-          <w:rFonts w:hint="default" w:ascii="Times New Roman" w:hAnsi="Times New Roman" w:cs="Times New Roman"/>
+          <w:rFonts w:hint="default" w:ascii="Arial" w:hAnsi="Arial" w:cs="Times New Roman"/>
           <w:color w:val="auto"/>
           <w:sz w:val="28"/>
           <w:szCs w:val="28"/>
@@ -896,7 +929,7 @@
       </w:pPr>
       <w:r>
         <w:rPr>
-          <w:rFonts w:hint="default" w:ascii="Times New Roman" w:hAnsi="Times New Roman" w:cs="Times New Roman"/>
+          <w:rFonts w:hint="default" w:ascii="Arial" w:hAnsi="Arial" w:cs="Times New Roman"/>
           <w:b w:val="0"/>
           <w:color w:val="auto"/>
           <w:sz w:val="28"/>
@@ -970,8 +1003,8 @@
             </w:pPr>
             <w:r>
               <w:rPr>
-                <w:rFonts w:hint="default" w:ascii="Times New Roman" w:hAnsi="Times New Roman" w:cs="Times New Roman"/>
-                <w:b w:val="0"/>
+                <w:rFonts w:hint="default" w:ascii="Arial" w:hAnsi="Arial" w:cs="Times New Roman"/>
+                <w:b/>
                 <w:color w:val="000000"/>
                 <w:sz w:val="28"/>
                 <w:szCs w:val="28"/>
@@ -1005,8 +1038,8 @@
             </w:pPr>
             <w:r>
               <w:rPr>
-                <w:rFonts w:hint="default" w:ascii="Times New Roman" w:hAnsi="Times New Roman" w:cs="Times New Roman"/>
-                <w:b w:val="0"/>
+                <w:rFonts w:hint="default" w:ascii="Arial" w:hAnsi="Arial" w:cs="Times New Roman"/>
+                <w:b/>
                 <w:color w:val="000000"/>
                 <w:sz w:val="28"/>
                 <w:szCs w:val="28"/>
@@ -1061,7 +1094,7 @@
             </w:pPr>
             <w:r>
               <w:rPr>
-                <w:rFonts w:hint="default" w:ascii="Times New Roman" w:hAnsi="Times New Roman" w:cs="Times New Roman"/>
+                <w:rFonts w:hint="default" w:ascii="Arial" w:hAnsi="Arial" w:cs="Times New Roman"/>
                 <w:b w:val="0"/>
                 <w:color w:val="000000"/>
                 <w:sz w:val="28"/>
@@ -1085,6 +1118,9 @@
           </w:tcPr>
           <w:p>
             <w:r>
+              <w:rPr>
+                <w:rFonts w:ascii="Arial" w:hAnsi="Arial"/>
+              </w:rPr>
               <w:t>Ядро</w:t>
             </w:r>
           </w:p>
@@ -1135,7 +1171,7 @@
             </w:pPr>
             <w:r>
               <w:rPr>
-                <w:rFonts w:hint="default" w:ascii="Times New Roman" w:hAnsi="Times New Roman" w:cs="Times New Roman"/>
+                <w:rFonts w:hint="default" w:ascii="Arial" w:hAnsi="Arial" w:cs="Times New Roman"/>
                 <w:b w:val="0"/>
                 <w:color w:val="000000"/>
                 <w:sz w:val="28"/>
@@ -1159,6 +1195,9 @@
           </w:tcPr>
           <w:p>
             <w:r>
+              <w:rPr>
+                <w:rFonts w:ascii="Arial" w:hAnsi="Arial"/>
+              </w:rPr>
               <w:t>Драйвер</w:t>
             </w:r>
           </w:p>
@@ -1209,7 +1248,7 @@
             </w:pPr>
             <w:r>
               <w:rPr>
-                <w:rFonts w:hint="default" w:ascii="Times New Roman" w:hAnsi="Times New Roman" w:cs="Times New Roman"/>
+                <w:rFonts w:hint="default" w:ascii="Arial" w:hAnsi="Arial" w:cs="Times New Roman"/>
                 <w:b w:val="0"/>
                 <w:color w:val="000000"/>
                 <w:sz w:val="28"/>
@@ -1233,6 +1272,9 @@
           </w:tcPr>
           <w:p>
             <w:r>
+              <w:rPr>
+                <w:rFonts w:ascii="Arial" w:hAnsi="Arial"/>
+              </w:rPr>
               <w:t>Пользовательское приложение</w:t>
             </w:r>
           </w:p>
@@ -1283,7 +1325,7 @@
             </w:pPr>
             <w:r>
               <w:rPr>
-                <w:rFonts w:hint="default" w:ascii="Times New Roman" w:hAnsi="Times New Roman" w:cs="Times New Roman"/>
+                <w:rFonts w:hint="default" w:ascii="Arial" w:hAnsi="Arial" w:cs="Times New Roman"/>
                 <w:b w:val="0"/>
                 <w:color w:val="000000"/>
                 <w:sz w:val="28"/>
@@ -1307,6 +1349,9 @@
           </w:tcPr>
           <w:p>
             <w:r>
+              <w:rPr>
+                <w:rFonts w:ascii="Arial" w:hAnsi="Arial"/>
+              </w:rPr>
               <w:t>Ядро</w:t>
             </w:r>
           </w:p>
@@ -1357,7 +1402,7 @@
             </w:pPr>
             <w:r>
               <w:rPr>
-                <w:rFonts w:hint="default" w:ascii="Times New Roman" w:hAnsi="Times New Roman" w:cs="Times New Roman"/>
+                <w:rFonts w:hint="default" w:ascii="Arial" w:hAnsi="Arial" w:cs="Times New Roman"/>
                 <w:b w:val="0"/>
                 <w:color w:val="000000"/>
                 <w:sz w:val="28"/>
@@ -1381,6 +1426,9 @@
           </w:tcPr>
           <w:p>
             <w:r>
+              <w:rPr>
+                <w:rFonts w:ascii="Arial" w:hAnsi="Arial"/>
+              </w:rPr>
               <w:t>Драйвер</w:t>
             </w:r>
           </w:p>
@@ -1431,7 +1479,7 @@
             </w:pPr>
             <w:r>
               <w:rPr>
-                <w:rFonts w:hint="default" w:ascii="Times New Roman" w:hAnsi="Times New Roman" w:cs="Times New Roman"/>
+                <w:rFonts w:hint="default" w:ascii="Arial" w:hAnsi="Arial" w:cs="Times New Roman"/>
                 <w:b w:val="0"/>
                 <w:color w:val="000000"/>
                 <w:sz w:val="28"/>
@@ -1455,6 +1503,9 @@
           </w:tcPr>
           <w:p>
             <w:r>
+              <w:rPr>
+                <w:rFonts w:ascii="Arial" w:hAnsi="Arial"/>
+              </w:rPr>
               <w:t>Пользовательское приложение</w:t>
             </w:r>
           </w:p>
@@ -1505,7 +1556,7 @@
             </w:pPr>
             <w:r>
               <w:rPr>
-                <w:rFonts w:hint="default" w:ascii="Times New Roman" w:hAnsi="Times New Roman" w:cs="Times New Roman"/>
+                <w:rFonts w:hint="default" w:ascii="Arial" w:hAnsi="Arial" w:cs="Times New Roman"/>
                 <w:b w:val="0"/>
                 <w:color w:val="000000"/>
                 <w:sz w:val="28"/>
@@ -1529,6 +1580,9 @@
           </w:tcPr>
           <w:p>
             <w:r>
+              <w:rPr>
+                <w:rFonts w:ascii="Arial" w:hAnsi="Arial"/>
+              </w:rPr>
               <w:t>Ядро</w:t>
             </w:r>
           </w:p>
@@ -1579,7 +1633,7 @@
             </w:pPr>
             <w:r>
               <w:rPr>
-                <w:rFonts w:hint="default" w:ascii="Times New Roman" w:hAnsi="Times New Roman" w:cs="Times New Roman"/>
+                <w:rFonts w:hint="default" w:ascii="Arial" w:hAnsi="Arial" w:cs="Times New Roman"/>
                 <w:b w:val="0"/>
                 <w:color w:val="000000"/>
                 <w:sz w:val="28"/>
@@ -1603,6 +1657,9 @@
           </w:tcPr>
           <w:p>
             <w:r>
+              <w:rPr>
+                <w:rFonts w:ascii="Arial" w:hAnsi="Arial"/>
+              </w:rPr>
               <w:t>API</w:t>
             </w:r>
           </w:p>
@@ -1621,7 +1678,7 @@
       </w:pPr>
       <w:r>
         <w:rPr>
-          <w:rFonts w:hint="default" w:ascii="Times New Roman" w:hAnsi="Times New Roman" w:cs="Times New Roman"/>
+          <w:rFonts w:hint="default" w:ascii="Arial" w:hAnsi="Arial" w:cs="Times New Roman"/>
           <w:b w:val="0"/>
           <w:color w:val="auto"/>
           <w:sz w:val="28"/>
@@ -1642,7 +1699,7 @@
       </w:pPr>
       <w:r>
         <w:rPr>
-          <w:rFonts w:hint="default" w:ascii="Times New Roman" w:hAnsi="Times New Roman" w:cs="Times New Roman"/>
+          <w:rFonts w:hint="default" w:ascii="Arial" w:hAnsi="Arial" w:cs="Times New Roman"/>
           <w:b/>
           <w:color w:val="auto"/>
           <w:sz w:val="28"/>
@@ -1652,6 +1709,7 @@
       </w:r>
       <w:r>
         <w:rPr>
+          <w:rFonts w:ascii="Arial" w:hAnsi="Arial"/>
           <w:b w:val="0"/>
         </w:rPr>
         <w:t>управление оперативной памятью, планирование процессов, обработка аппаратного прерывания.</w:t>
@@ -1669,7 +1727,7 @@
       </w:pPr>
       <w:r>
         <w:rPr>
-          <w:rFonts w:hint="default" w:ascii="Times New Roman" w:hAnsi="Times New Roman" w:cs="Times New Roman"/>
+          <w:rFonts w:hint="default" w:ascii="Arial" w:hAnsi="Arial" w:cs="Times New Roman"/>
           <w:color w:val="auto"/>
           <w:sz w:val="28"/>
           <w:szCs w:val="28"/>
@@ -1689,7 +1747,7 @@
       </w:pPr>
       <w:r>
         <w:rPr>
-          <w:rFonts w:hint="default" w:ascii="Times New Roman" w:hAnsi="Times New Roman" w:cs="Times New Roman"/>
+          <w:rFonts w:hint="default" w:ascii="Arial" w:hAnsi="Arial" w:cs="Times New Roman"/>
           <w:b w:val="0"/>
           <w:color w:val="auto"/>
           <w:sz w:val="28"/>
@@ -1769,8 +1827,8 @@
             </w:pPr>
             <w:r>
               <w:rPr>
-                <w:rFonts w:hint="default" w:ascii="Times New Roman" w:hAnsi="Times New Roman" w:cs="Times New Roman"/>
-                <w:b w:val="0"/>
+                <w:rFonts w:hint="default" w:ascii="Arial" w:hAnsi="Arial" w:cs="Times New Roman"/>
+                <w:b/>
                 <w:color w:val="000000"/>
                 <w:sz w:val="28"/>
                 <w:szCs w:val="28"/>
@@ -1804,8 +1862,8 @@
             </w:pPr>
             <w:r>
               <w:rPr>
-                <w:rFonts w:hint="default" w:ascii="Times New Roman" w:hAnsi="Times New Roman" w:cs="Times New Roman"/>
-                <w:b w:val="0"/>
+                <w:rFonts w:hint="default" w:ascii="Arial" w:hAnsi="Arial" w:cs="Times New Roman"/>
+                <w:b/>
                 <w:color w:val="000000"/>
                 <w:sz w:val="28"/>
                 <w:szCs w:val="28"/>
@@ -1860,7 +1918,7 @@
             </w:pPr>
             <w:r>
               <w:rPr>
-                <w:rFonts w:hint="default" w:ascii="Times New Roman" w:hAnsi="Times New Roman" w:cs="Times New Roman"/>
+                <w:rFonts w:hint="default" w:ascii="Arial" w:hAnsi="Arial" w:cs="Times New Roman"/>
                 <w:b w:val="0"/>
                 <w:color w:val="000000"/>
                 <w:sz w:val="28"/>
@@ -1884,6 +1942,9 @@
           </w:tcPr>
           <w:p>
             <w:r>
+              <w:rPr>
+                <w:rFonts w:ascii="Arial" w:hAnsi="Arial"/>
+              </w:rPr>
               <w:t>Программа</w:t>
             </w:r>
           </w:p>
@@ -1934,7 +1995,7 @@
             </w:pPr>
             <w:r>
               <w:rPr>
-                <w:rFonts w:hint="default" w:ascii="Times New Roman" w:hAnsi="Times New Roman" w:cs="Times New Roman"/>
+                <w:rFonts w:hint="default" w:ascii="Arial" w:hAnsi="Arial" w:cs="Times New Roman"/>
                 <w:b w:val="0"/>
                 <w:color w:val="000000"/>
                 <w:sz w:val="28"/>
@@ -1958,6 +2019,9 @@
           </w:tcPr>
           <w:p>
             <w:r>
+              <w:rPr>
+                <w:rFonts w:ascii="Arial" w:hAnsi="Arial"/>
+              </w:rPr>
               <w:t>Процесс</w:t>
             </w:r>
           </w:p>
@@ -2008,7 +2072,7 @@
             </w:pPr>
             <w:r>
               <w:rPr>
-                <w:rFonts w:hint="default" w:ascii="Times New Roman" w:hAnsi="Times New Roman" w:cs="Times New Roman"/>
+                <w:rFonts w:hint="default" w:ascii="Arial" w:hAnsi="Arial" w:cs="Times New Roman"/>
                 <w:b w:val="0"/>
                 <w:color w:val="000000"/>
                 <w:sz w:val="28"/>
@@ -2032,6 +2096,9 @@
           </w:tcPr>
           <w:p>
             <w:r>
+              <w:rPr>
+                <w:rFonts w:ascii="Arial" w:hAnsi="Arial"/>
+              </w:rPr>
               <w:t>Процесс</w:t>
             </w:r>
           </w:p>
@@ -2082,7 +2149,7 @@
             </w:pPr>
             <w:r>
               <w:rPr>
-                <w:rFonts w:hint="default" w:ascii="Times New Roman" w:hAnsi="Times New Roman" w:cs="Times New Roman"/>
+                <w:rFonts w:hint="default" w:ascii="Arial" w:hAnsi="Arial" w:cs="Times New Roman"/>
                 <w:b w:val="0"/>
                 <w:color w:val="000000"/>
                 <w:sz w:val="28"/>
@@ -2106,6 +2173,9 @@
           </w:tcPr>
           <w:p>
             <w:r>
+              <w:rPr>
+                <w:rFonts w:ascii="Arial" w:hAnsi="Arial"/>
+              </w:rPr>
               <w:t>Процесс</w:t>
             </w:r>
           </w:p>
@@ -2156,7 +2226,7 @@
             </w:pPr>
             <w:r>
               <w:rPr>
-                <w:rFonts w:hint="default" w:ascii="Times New Roman" w:hAnsi="Times New Roman" w:cs="Times New Roman"/>
+                <w:rFonts w:hint="default" w:ascii="Arial" w:hAnsi="Arial" w:cs="Times New Roman"/>
                 <w:b w:val="0"/>
                 <w:color w:val="000000"/>
                 <w:sz w:val="28"/>
@@ -2180,6 +2250,9 @@
           </w:tcPr>
           <w:p>
             <w:r>
+              <w:rPr>
+                <w:rFonts w:ascii="Arial" w:hAnsi="Arial"/>
+              </w:rPr>
               <w:t>Программа</w:t>
             </w:r>
           </w:p>
@@ -2230,7 +2303,7 @@
             </w:pPr>
             <w:r>
               <w:rPr>
-                <w:rFonts w:hint="default" w:ascii="Times New Roman" w:hAnsi="Times New Roman" w:cs="Times New Roman"/>
+                <w:rFonts w:hint="default" w:ascii="Arial" w:hAnsi="Arial" w:cs="Times New Roman"/>
                 <w:b w:val="0"/>
                 <w:color w:val="000000"/>
                 <w:sz w:val="28"/>
@@ -2254,6 +2327,9 @@
           </w:tcPr>
           <w:p>
             <w:r>
+              <w:rPr>
+                <w:rFonts w:ascii="Arial" w:hAnsi="Arial"/>
+              </w:rPr>
               <w:t>Процесс</w:t>
             </w:r>
           </w:p>
@@ -2272,7 +2348,7 @@
       </w:pPr>
       <w:r>
         <w:rPr>
-          <w:rFonts w:hint="default" w:ascii="Times New Roman" w:hAnsi="Times New Roman" w:cs="Times New Roman"/>
+          <w:rFonts w:hint="default" w:ascii="Arial" w:hAnsi="Arial" w:cs="Times New Roman"/>
           <w:b w:val="0"/>
           <w:color w:val="auto"/>
           <w:sz w:val="28"/>
@@ -2293,7 +2369,7 @@
       </w:pPr>
       <w:r>
         <w:rPr>
-          <w:rFonts w:hint="default" w:ascii="Times New Roman" w:hAnsi="Times New Roman" w:cs="Times New Roman"/>
+          <w:rFonts w:hint="default" w:ascii="Arial" w:hAnsi="Arial" w:cs="Times New Roman"/>
           <w:b/>
           <w:color w:val="auto"/>
           <w:sz w:val="28"/>
@@ -2303,9 +2379,10 @@
       </w:r>
       <w:r>
         <w:rPr>
+          <w:rFonts w:ascii="Arial" w:hAnsi="Arial"/>
           <w:b w:val="0"/>
         </w:rPr>
-        <w:t>Каждый запуск создаёт отдельный процесс со своим адресным пространством; кроме того, программа может сама запускать дочерние процессы (например, вкладки браузера для изоляции и параллельной работы).</w:t>
+        <w:t>При каждом запуске создаётся отдельный процесс со своим адресным пространством. Кроме того, программа может сама создавать дочерние процессы, например вкладки браузера, для изоляции и параллельной работы.</w:t>
       </w:r>
     </w:p>
     <w:p>
@@ -2320,7 +2397,7 @@
       </w:pPr>
       <w:r>
         <w:rPr>
-          <w:rFonts w:hint="default" w:ascii="Times New Roman" w:hAnsi="Times New Roman" w:cs="Times New Roman"/>
+          <w:rFonts w:hint="default" w:ascii="Arial" w:hAnsi="Arial" w:cs="Times New Roman"/>
           <w:color w:val="auto"/>
           <w:sz w:val="28"/>
           <w:szCs w:val="28"/>
@@ -2340,7 +2417,7 @@
       </w:pPr>
       <w:r>
         <w:rPr>
-          <w:rFonts w:hint="default" w:ascii="Times New Roman" w:hAnsi="Times New Roman" w:cs="Times New Roman"/>
+          <w:rFonts w:hint="default" w:ascii="Arial" w:hAnsi="Arial" w:cs="Times New Roman"/>
           <w:b w:val="0"/>
           <w:color w:val="auto"/>
           <w:sz w:val="28"/>
@@ -2421,8 +2498,8 @@
             </w:pPr>
             <w:r>
               <w:rPr>
-                <w:rFonts w:hint="default" w:ascii="Times New Roman" w:hAnsi="Times New Roman" w:cs="Times New Roman"/>
-                <w:b w:val="0"/>
+                <w:rFonts w:hint="default" w:ascii="Arial" w:hAnsi="Arial" w:cs="Times New Roman"/>
+                <w:b/>
                 <w:color w:val="000000"/>
                 <w:sz w:val="28"/>
                 <w:szCs w:val="28"/>
@@ -2456,8 +2533,8 @@
             </w:pPr>
             <w:r>
               <w:rPr>
-                <w:rFonts w:hint="default" w:ascii="Times New Roman" w:hAnsi="Times New Roman" w:cs="Times New Roman"/>
-                <w:b w:val="0"/>
+                <w:rFonts w:hint="default" w:ascii="Arial" w:hAnsi="Arial" w:cs="Times New Roman"/>
+                <w:b/>
                 <w:color w:val="000000"/>
                 <w:sz w:val="28"/>
                 <w:szCs w:val="28"/>
@@ -2491,8 +2568,8 @@
             </w:pPr>
             <w:r>
               <w:rPr>
-                <w:rFonts w:hint="default" w:ascii="Times New Roman" w:hAnsi="Times New Roman" w:cs="Times New Roman"/>
-                <w:b w:val="0"/>
+                <w:rFonts w:hint="default" w:ascii="Arial" w:hAnsi="Arial" w:cs="Times New Roman"/>
+                <w:b/>
                 <w:color w:val="000000"/>
                 <w:sz w:val="28"/>
                 <w:szCs w:val="28"/>
@@ -2547,7 +2624,7 @@
             </w:pPr>
             <w:r>
               <w:rPr>
-                <w:rFonts w:hint="default" w:ascii="Times New Roman" w:hAnsi="Times New Roman" w:cs="Times New Roman"/>
+                <w:rFonts w:hint="default" w:ascii="Arial" w:hAnsi="Arial" w:cs="Times New Roman"/>
                 <w:b w:val="0"/>
                 <w:color w:val="000000"/>
                 <w:sz w:val="28"/>
@@ -2571,6 +2648,9 @@
           </w:tcPr>
           <w:p>
             <w:r>
+              <w:rPr>
+                <w:rFonts w:ascii="Arial" w:hAnsi="Arial"/>
+              </w:rPr>
               <w:t>Драйвер видеокарты</w:t>
             </w:r>
           </w:p>
@@ -2589,6 +2669,9 @@
           </w:tcPr>
           <w:p>
             <w:r>
+              <w:rPr>
+                <w:rFonts w:ascii="Arial" w:hAnsi="Arial"/>
+              </w:rPr>
               <w:t>Передаёт ОС команды для вывода изображения и ускорения графики</w:t>
             </w:r>
           </w:p>
@@ -2639,7 +2722,7 @@
             </w:pPr>
             <w:r>
               <w:rPr>
-                <w:rFonts w:hint="default" w:ascii="Times New Roman" w:hAnsi="Times New Roman" w:cs="Times New Roman"/>
+                <w:rFonts w:hint="default" w:ascii="Arial" w:hAnsi="Arial" w:cs="Times New Roman"/>
                 <w:b w:val="0"/>
                 <w:color w:val="000000"/>
                 <w:sz w:val="28"/>
@@ -2663,6 +2746,9 @@
           </w:tcPr>
           <w:p>
             <w:r>
+              <w:rPr>
+                <w:rFonts w:ascii="Arial" w:hAnsi="Arial"/>
+              </w:rPr>
               <w:t>Драйвер принтера</w:t>
             </w:r>
           </w:p>
@@ -2681,6 +2767,9 @@
           </w:tcPr>
           <w:p>
             <w:r>
+              <w:rPr>
+                <w:rFonts w:ascii="Arial" w:hAnsi="Arial"/>
+              </w:rPr>
               <w:t>Преобразует документ в команды печати для конкретной модели</w:t>
             </w:r>
           </w:p>
@@ -2731,7 +2820,7 @@
             </w:pPr>
             <w:r>
               <w:rPr>
-                <w:rFonts w:hint="default" w:ascii="Times New Roman" w:hAnsi="Times New Roman" w:cs="Times New Roman"/>
+                <w:rFonts w:hint="default" w:ascii="Arial" w:hAnsi="Arial" w:cs="Times New Roman"/>
                 <w:b w:val="0"/>
                 <w:color w:val="000000"/>
                 <w:sz w:val="28"/>
@@ -2755,6 +2844,9 @@
           </w:tcPr>
           <w:p>
             <w:r>
+              <w:rPr>
+                <w:rFonts w:ascii="Arial" w:hAnsi="Arial"/>
+              </w:rPr>
               <w:t>Драйвер сетевого адаптера</w:t>
             </w:r>
           </w:p>
@@ -2773,6 +2865,9 @@
           </w:tcPr>
           <w:p>
             <w:r>
+              <w:rPr>
+                <w:rFonts w:ascii="Arial" w:hAnsi="Arial"/>
+              </w:rPr>
               <w:t>Отправка и приём сетевых пакетов, подключение к сети</w:t>
             </w:r>
           </w:p>
@@ -2823,7 +2918,7 @@
             </w:pPr>
             <w:r>
               <w:rPr>
-                <w:rFonts w:hint="default" w:ascii="Times New Roman" w:hAnsi="Times New Roman" w:cs="Times New Roman"/>
+                <w:rFonts w:hint="default" w:ascii="Arial" w:hAnsi="Arial" w:cs="Times New Roman"/>
                 <w:b w:val="0"/>
                 <w:color w:val="000000"/>
                 <w:sz w:val="28"/>
@@ -2847,6 +2942,9 @@
           </w:tcPr>
           <w:p>
             <w:r>
+              <w:rPr>
+                <w:rFonts w:ascii="Arial" w:hAnsi="Arial"/>
+              </w:rPr>
               <w:t>Драйвер звуковой карты</w:t>
             </w:r>
           </w:p>
@@ -2865,6 +2963,9 @@
           </w:tcPr>
           <w:p>
             <w:r>
+              <w:rPr>
+                <w:rFonts w:ascii="Arial" w:hAnsi="Arial"/>
+              </w:rPr>
               <w:t>Воспроизведение и запись звука</w:t>
             </w:r>
           </w:p>
@@ -2915,7 +3016,7 @@
             </w:pPr>
             <w:r>
               <w:rPr>
-                <w:rFonts w:hint="default" w:ascii="Times New Roman" w:hAnsi="Times New Roman" w:cs="Times New Roman"/>
+                <w:rFonts w:hint="default" w:ascii="Arial" w:hAnsi="Arial" w:cs="Times New Roman"/>
                 <w:b w:val="0"/>
                 <w:color w:val="000000"/>
                 <w:sz w:val="28"/>
@@ -2939,6 +3040,9 @@
           </w:tcPr>
           <w:p>
             <w:r>
+              <w:rPr>
+                <w:rFonts w:ascii="Arial" w:hAnsi="Arial"/>
+              </w:rPr>
               <w:t>Драйвер клавиатуры (HID)</w:t>
             </w:r>
           </w:p>
@@ -2957,6 +3061,9 @@
           </w:tcPr>
           <w:p>
             <w:r>
+              <w:rPr>
+                <w:rFonts w:ascii="Arial" w:hAnsi="Arial"/>
+              </w:rPr>
               <w:t>Преобразует нажатия клавиш в события для ОС и приложений</w:t>
             </w:r>
           </w:p>
@@ -2975,7 +3082,7 @@
       </w:pPr>
       <w:r>
         <w:rPr>
-          <w:rFonts w:hint="default" w:ascii="Times New Roman" w:hAnsi="Times New Roman" w:cs="Times New Roman"/>
+          <w:rFonts w:hint="default" w:ascii="Arial" w:hAnsi="Arial" w:cs="Times New Roman"/>
           <w:b w:val="0"/>
           <w:color w:val="auto"/>
           <w:sz w:val="28"/>
@@ -2996,7 +3103,7 @@
       </w:pPr>
       <w:r>
         <w:rPr>
-          <w:rFonts w:hint="default" w:ascii="Times New Roman" w:hAnsi="Times New Roman" w:cs="Times New Roman"/>
+          <w:rFonts w:hint="default" w:ascii="Arial" w:hAnsi="Arial" w:cs="Times New Roman"/>
           <w:b/>
           <w:color w:val="auto"/>
           <w:sz w:val="28"/>
@@ -3006,9 +3113,10 @@
       </w:r>
       <w:r>
         <w:rPr>
+          <w:rFonts w:ascii="Arial" w:hAnsi="Arial"/>
           <w:b w:val="0"/>
         </w:rPr>
-        <w:t>Устройства очень разные по устройству и командам. Драйвер скрывает эти различия и даёт ОС единый интерфейс, поэтому ОС не нужно знать особенности каждой модели, а ошибки и доступ к устройству контролируются.</w:t>
+        <w:t>Все устройства устроены по-разному и понимают разные команды. Драйвер скрывает эти различия и даёт ОС единый интерфейс, поэтому ОС не должна знать особенности каждой модели, а доступ к устройству остаётся под контролем.</w:t>
       </w:r>
     </w:p>
     <w:p>
@@ -3023,7 +3131,7 @@
       </w:pPr>
       <w:r>
         <w:rPr>
-          <w:rFonts w:hint="default" w:ascii="Times New Roman" w:hAnsi="Times New Roman" w:cs="Times New Roman"/>
+          <w:rFonts w:hint="default" w:ascii="Arial" w:hAnsi="Arial" w:cs="Times New Roman"/>
           <w:color w:val="auto"/>
           <w:sz w:val="28"/>
           <w:szCs w:val="28"/>
@@ -3043,7 +3151,7 @@
       </w:pPr>
       <w:r>
         <w:rPr>
-          <w:rFonts w:hint="default" w:ascii="Times New Roman" w:hAnsi="Times New Roman" w:cs="Times New Roman"/>
+          <w:rFonts w:hint="default" w:ascii="Arial" w:hAnsi="Arial" w:cs="Times New Roman"/>
           <w:b w:val="0"/>
           <w:color w:val="auto"/>
           <w:sz w:val="28"/>
@@ -3065,7 +3173,7 @@
       </w:pPr>
       <w:r>
         <w:rPr>
-          <w:rFonts w:hint="default" w:ascii="Times New Roman" w:hAnsi="Times New Roman" w:cs="Times New Roman"/>
+          <w:rFonts w:hint="default" w:ascii="Arial" w:hAnsi="Arial" w:cs="Times New Roman"/>
           <w:b w:val="0"/>
           <w:color w:val="auto"/>
           <w:sz w:val="28"/>
@@ -3086,7 +3194,7 @@
       </w:pPr>
       <w:r>
         <w:rPr>
-          <w:rFonts w:hint="default" w:ascii="Times New Roman" w:hAnsi="Times New Roman" w:cs="Times New Roman"/>
+          <w:rFonts w:hint="default" w:ascii="Arial" w:hAnsi="Arial" w:cs="Times New Roman"/>
           <w:b w:val="0"/>
           <w:color w:val="auto"/>
           <w:sz w:val="28"/>
@@ -3109,7 +3217,7 @@
       </w:pPr>
       <w:r>
         <w:rPr>
-          <w:rFonts w:hint="default" w:ascii="Times New Roman" w:hAnsi="Times New Roman" w:cs="Times New Roman"/>
+          <w:rFonts w:hint="default" w:ascii="Arial" w:hAnsi="Arial" w:cs="Times New Roman"/>
           <w:b w:val="0"/>
           <w:color w:val="auto"/>
           <w:sz w:val="28"/>
@@ -3119,7 +3227,7 @@
       </w:r>
       <w:r>
         <w:rPr>
-          <w:rFonts w:hint="default" w:cs="Times New Roman"/>
+          <w:rFonts w:hint="default" w:cs="Times New Roman" w:ascii="Arial" w:hAnsi="Arial"/>
           <w:b w:val="0"/>
           <w:color w:val="auto"/>
           <w:sz w:val="28"/>
@@ -3141,7 +3249,7 @@
       </w:pPr>
       <w:r>
         <w:rPr>
-          <w:rFonts w:hint="default" w:ascii="Times New Roman" w:hAnsi="Times New Roman" w:cs="Times New Roman"/>
+          <w:rFonts w:hint="default" w:ascii="Arial" w:hAnsi="Arial" w:cs="Times New Roman"/>
           <w:b w:val="0"/>
           <w:color w:val="auto"/>
           <w:sz w:val="28"/>
@@ -3162,7 +3270,7 @@
       </w:pPr>
       <w:r>
         <w:rPr>
-          <w:rFonts w:hint="default" w:ascii="Times New Roman" w:hAnsi="Times New Roman" w:cs="Times New Roman"/>
+          <w:rFonts w:hint="default" w:ascii="Arial" w:hAnsi="Arial" w:cs="Times New Roman"/>
           <w:b w:val="0"/>
           <w:color w:val="auto"/>
           <w:sz w:val="28"/>
@@ -3183,7 +3291,7 @@
       </w:pPr>
       <w:r>
         <w:rPr>
-          <w:rFonts w:hint="default" w:ascii="Times New Roman" w:hAnsi="Times New Roman" w:cs="Times New Roman"/>
+          <w:rFonts w:hint="default" w:ascii="Arial" w:hAnsi="Arial" w:cs="Times New Roman"/>
           <w:b w:val="0"/>
           <w:color w:val="auto"/>
           <w:sz w:val="28"/>
@@ -3204,7 +3312,7 @@
       </w:pPr>
       <w:r>
         <w:rPr>
-          <w:rFonts w:hint="default" w:ascii="Times New Roman" w:hAnsi="Times New Roman" w:cs="Times New Roman"/>
+          <w:rFonts w:hint="default" w:ascii="Arial" w:hAnsi="Arial" w:cs="Times New Roman"/>
           <w:b w:val="0"/>
           <w:color w:val="auto"/>
           <w:sz w:val="28"/>
@@ -3225,7 +3333,7 @@
       </w:pPr>
       <w:r>
         <w:rPr>
-          <w:rFonts w:hint="default" w:ascii="Times New Roman" w:hAnsi="Times New Roman" w:cs="Times New Roman"/>
+          <w:rFonts w:hint="default" w:ascii="Arial" w:hAnsi="Arial" w:cs="Times New Roman"/>
           <w:b w:val="0"/>
           <w:color w:val="auto"/>
           <w:sz w:val="28"/>
@@ -3246,7 +3354,7 @@
       </w:pPr>
       <w:r>
         <w:rPr>
-          <w:rFonts w:hint="default" w:ascii="Times New Roman" w:hAnsi="Times New Roman" w:cs="Times New Roman"/>
+          <w:rFonts w:hint="default" w:ascii="Arial" w:hAnsi="Arial" w:cs="Times New Roman"/>
           <w:b w:val="0"/>
           <w:color w:val="auto"/>
           <w:sz w:val="28"/>
@@ -3267,7 +3375,7 @@
       </w:pPr>
       <w:r>
         <w:rPr>
-          <w:rFonts w:hint="default" w:ascii="Times New Roman" w:hAnsi="Times New Roman" w:cs="Times New Roman"/>
+          <w:rFonts w:hint="default" w:ascii="Arial" w:hAnsi="Arial" w:cs="Times New Roman"/>
           <w:b w:val="0"/>
           <w:color w:val="auto"/>
           <w:sz w:val="28"/>
@@ -3327,7 +3435,7 @@
       </w:pPr>
       <w:r>
         <w:rPr>
-          <w:rFonts w:hint="default" w:ascii="Times New Roman" w:hAnsi="Times New Roman" w:cs="Times New Roman"/>
+          <w:rFonts w:hint="default" w:ascii="Arial" w:hAnsi="Arial" w:cs="Times New Roman"/>
           <w:color w:val="auto"/>
           <w:sz w:val="28"/>
           <w:szCs w:val="28"/>
@@ -3347,7 +3455,7 @@
       </w:pPr>
       <w:r>
         <w:rPr>
-          <w:rFonts w:hint="default" w:ascii="Times New Roman" w:hAnsi="Times New Roman" w:cs="Times New Roman"/>
+          <w:rFonts w:hint="default" w:ascii="Arial" w:hAnsi="Arial" w:cs="Times New Roman"/>
           <w:b w:val="0"/>
           <w:color w:val="auto"/>
           <w:sz w:val="28"/>
@@ -3428,8 +3536,8 @@
             </w:pPr>
             <w:r>
               <w:rPr>
-                <w:rFonts w:hint="default" w:ascii="Times New Roman" w:hAnsi="Times New Roman" w:cs="Times New Roman"/>
-                <w:b w:val="0"/>
+                <w:rFonts w:hint="default" w:ascii="Arial" w:hAnsi="Arial" w:cs="Times New Roman"/>
+                <w:b/>
                 <w:color w:val="000000"/>
                 <w:sz w:val="28"/>
                 <w:szCs w:val="28"/>
@@ -3463,8 +3571,8 @@
             </w:pPr>
             <w:r>
               <w:rPr>
-                <w:rFonts w:hint="default" w:ascii="Times New Roman" w:hAnsi="Times New Roman" w:cs="Times New Roman"/>
-                <w:b w:val="0"/>
+                <w:rFonts w:hint="default" w:ascii="Arial" w:hAnsi="Arial" w:cs="Times New Roman"/>
+                <w:b/>
                 <w:color w:val="000000"/>
                 <w:sz w:val="28"/>
                 <w:szCs w:val="28"/>
@@ -3498,8 +3606,8 @@
             </w:pPr>
             <w:r>
               <w:rPr>
-                <w:rFonts w:hint="default" w:ascii="Times New Roman" w:hAnsi="Times New Roman" w:cs="Times New Roman"/>
-                <w:b w:val="0"/>
+                <w:rFonts w:hint="default" w:ascii="Arial" w:hAnsi="Arial" w:cs="Times New Roman"/>
+                <w:b/>
                 <w:color w:val="000000"/>
                 <w:sz w:val="28"/>
                 <w:szCs w:val="28"/>
@@ -3554,7 +3662,7 @@
             </w:pPr>
             <w:r>
               <w:rPr>
-                <w:rFonts w:hint="default" w:ascii="Times New Roman" w:hAnsi="Times New Roman" w:cs="Times New Roman"/>
+                <w:rFonts w:hint="default" w:ascii="Arial" w:hAnsi="Arial" w:cs="Times New Roman"/>
                 <w:b w:val="0"/>
                 <w:color w:val="000000"/>
                 <w:sz w:val="28"/>
@@ -3578,6 +3686,9 @@
           </w:tcPr>
           <w:p>
             <w:r>
+              <w:rPr>
+                <w:rFonts w:ascii="Arial" w:hAnsi="Arial"/>
+              </w:rPr>
               <w:t>Большой: в ядре почти всё</w:t>
             </w:r>
           </w:p>
@@ -3596,6 +3707,9 @@
           </w:tcPr>
           <w:p>
             <w:r>
+              <w:rPr>
+                <w:rFonts w:ascii="Arial" w:hAnsi="Arial"/>
+              </w:rPr>
               <w:t>Минимальный: только базовые функции</w:t>
             </w:r>
           </w:p>
@@ -3646,7 +3760,7 @@
             </w:pPr>
             <w:r>
               <w:rPr>
-                <w:rFonts w:hint="default" w:ascii="Times New Roman" w:hAnsi="Times New Roman" w:cs="Times New Roman"/>
+                <w:rFonts w:hint="default" w:ascii="Arial" w:hAnsi="Arial" w:cs="Times New Roman"/>
                 <w:b w:val="0"/>
                 <w:color w:val="000000"/>
                 <w:sz w:val="28"/>
@@ -3670,6 +3784,9 @@
           </w:tcPr>
           <w:p>
             <w:r>
+              <w:rPr>
+                <w:rFonts w:ascii="Arial" w:hAnsi="Arial"/>
+              </w:rPr>
               <w:t>Внутри ядра</w:t>
             </w:r>
           </w:p>
@@ -3688,6 +3805,9 @@
           </w:tcPr>
           <w:p>
             <w:r>
+              <w:rPr>
+                <w:rFonts w:ascii="Arial" w:hAnsi="Arial"/>
+              </w:rPr>
               <w:t>В пространстве пользователя, как отдельные процессы</w:t>
             </w:r>
           </w:p>
@@ -3738,7 +3858,7 @@
             </w:pPr>
             <w:r>
               <w:rPr>
-                <w:rFonts w:hint="default" w:ascii="Times New Roman" w:hAnsi="Times New Roman" w:cs="Times New Roman"/>
+                <w:rFonts w:hint="default" w:ascii="Arial" w:hAnsi="Arial" w:cs="Times New Roman"/>
                 <w:b w:val="0"/>
                 <w:color w:val="000000"/>
                 <w:sz w:val="28"/>
@@ -3762,6 +3882,9 @@
           </w:tcPr>
           <w:p>
             <w:r>
+              <w:rPr>
+                <w:rFonts w:ascii="Arial" w:hAnsi="Arial"/>
+              </w:rPr>
               <w:t>Прямые вызовы функций внутри ядра</w:t>
             </w:r>
           </w:p>
@@ -3780,6 +3903,9 @@
           </w:tcPr>
           <w:p>
             <w:r>
+              <w:rPr>
+                <w:rFonts w:ascii="Arial" w:hAnsi="Arial"/>
+              </w:rPr>
               <w:t>Обмен сообщениями между процессами (IPC)</w:t>
             </w:r>
           </w:p>
@@ -3830,7 +3956,7 @@
             </w:pPr>
             <w:r>
               <w:rPr>
-                <w:rFonts w:hint="default" w:ascii="Times New Roman" w:hAnsi="Times New Roman" w:cs="Times New Roman"/>
+                <w:rFonts w:hint="default" w:ascii="Arial" w:hAnsi="Arial" w:cs="Times New Roman"/>
                 <w:b w:val="0"/>
                 <w:color w:val="000000"/>
                 <w:sz w:val="28"/>
@@ -3854,6 +3980,9 @@
           </w:tcPr>
           <w:p>
             <w:r>
+              <w:rPr>
+                <w:rFonts w:ascii="Arial" w:hAnsi="Arial"/>
+              </w:rPr>
               <w:t>Выше: меньше переключений контекста</w:t>
             </w:r>
           </w:p>
@@ -3872,6 +4001,9 @@
           </w:tcPr>
           <w:p>
             <w:r>
+              <w:rPr>
+                <w:rFonts w:ascii="Arial" w:hAnsi="Arial"/>
+              </w:rPr>
               <w:t>Ниже: накладные расходы на передачу сообщений</w:t>
             </w:r>
           </w:p>
@@ -3922,7 +4054,7 @@
             </w:pPr>
             <w:r>
               <w:rPr>
-                <w:rFonts w:hint="default" w:ascii="Times New Roman" w:hAnsi="Times New Roman" w:cs="Times New Roman"/>
+                <w:rFonts w:hint="default" w:ascii="Arial" w:hAnsi="Arial" w:cs="Times New Roman"/>
                 <w:b w:val="0"/>
                 <w:color w:val="000000"/>
                 <w:sz w:val="28"/>
@@ -3946,6 +4078,9 @@
           </w:tcPr>
           <w:p>
             <w:r>
+              <w:rPr>
+                <w:rFonts w:ascii="Arial" w:hAnsi="Arial"/>
+              </w:rPr>
               <w:t>Слабая: ошибка компонента может нарушить всё ядро</w:t>
             </w:r>
           </w:p>
@@ -3964,6 +4099,9 @@
           </w:tcPr>
           <w:p>
             <w:r>
+              <w:rPr>
+                <w:rFonts w:ascii="Arial" w:hAnsi="Arial"/>
+              </w:rPr>
               <w:t>Высокая: компоненты изолированы друг от друга</w:t>
             </w:r>
           </w:p>
@@ -4014,7 +4152,7 @@
             </w:pPr>
             <w:r>
               <w:rPr>
-                <w:rFonts w:hint="default" w:ascii="Times New Roman" w:hAnsi="Times New Roman" w:cs="Times New Roman"/>
+                <w:rFonts w:hint="default" w:ascii="Arial" w:hAnsi="Arial" w:cs="Times New Roman"/>
                 <w:b w:val="0"/>
                 <w:color w:val="000000"/>
                 <w:sz w:val="28"/>
@@ -4038,6 +4176,9 @@
           </w:tcPr>
           <w:p>
             <w:r>
+              <w:rPr>
+                <w:rFonts w:ascii="Arial" w:hAnsi="Arial"/>
+              </w:rPr>
               <w:t>Ниже: изменения часто требуют пересборки/перезагрузки</w:t>
             </w:r>
           </w:p>
@@ -4056,6 +4197,9 @@
           </w:tcPr>
           <w:p>
             <w:r>
+              <w:rPr>
+                <w:rFonts w:ascii="Arial" w:hAnsi="Arial"/>
+              </w:rPr>
               <w:t>Выше: компоненты можно заменять и перезапускать отдельно</w:t>
             </w:r>
           </w:p>
@@ -4074,7 +4218,7 @@
       </w:pPr>
       <w:r>
         <w:rPr>
-          <w:rFonts w:hint="default" w:ascii="Times New Roman" w:hAnsi="Times New Roman" w:cs="Times New Roman"/>
+          <w:rFonts w:hint="default" w:ascii="Arial" w:hAnsi="Arial" w:cs="Times New Roman"/>
           <w:b w:val="0"/>
           <w:color w:val="auto"/>
           <w:sz w:val="28"/>
@@ -4095,7 +4239,7 @@
       </w:pPr>
       <w:r>
         <w:rPr>
-          <w:rFonts w:hint="default" w:ascii="Times New Roman" w:hAnsi="Times New Roman" w:cs="Times New Roman"/>
+          <w:rFonts w:hint="default" w:ascii="Arial" w:hAnsi="Arial" w:cs="Times New Roman"/>
           <w:b/>
           <w:color w:val="auto"/>
           <w:sz w:val="28"/>
@@ -4105,6 +4249,7 @@
       </w:r>
       <w:r>
         <w:rPr>
+          <w:rFonts w:ascii="Arial" w:hAnsi="Arial"/>
           <w:b w:val="0"/>
         </w:rPr>
         <w:t>В монолитном ядре драйвер работает в режиме ядра, поэтому его сбой может привести к краху всей ОС (синий экран, kernel panic). В микроядре драйвер — отдельный процесс в пространстве пользователя: система продолжит работать, а драйвер можно перезапустить; пострадает лишь сеть.</w:t>
@@ -4122,7 +4267,7 @@
       </w:pPr>
       <w:r>
         <w:rPr>
-          <w:rFonts w:hint="default" w:ascii="Times New Roman" w:hAnsi="Times New Roman" w:cs="Times New Roman"/>
+          <w:rFonts w:hint="default" w:ascii="Arial" w:hAnsi="Arial" w:cs="Times New Roman"/>
           <w:color w:val="auto"/>
           <w:sz w:val="28"/>
           <w:szCs w:val="28"/>
@@ -4142,7 +4287,7 @@
       </w:pPr>
       <w:r>
         <w:rPr>
-          <w:rFonts w:hint="default" w:ascii="Times New Roman" w:hAnsi="Times New Roman" w:cs="Times New Roman"/>
+          <w:rFonts w:hint="default" w:ascii="Arial" w:hAnsi="Arial" w:cs="Times New Roman"/>
           <w:b w:val="0"/>
           <w:color w:val="auto"/>
           <w:sz w:val="28"/>
@@ -4163,7 +4308,7 @@
       </w:pPr>
       <w:r>
         <w:rPr>
-          <w:rFonts w:hint="default" w:ascii="Times New Roman" w:hAnsi="Times New Roman" w:cs="Times New Roman"/>
+          <w:rFonts w:hint="default" w:ascii="Arial" w:hAnsi="Arial" w:cs="Times New Roman"/>
           <w:b w:val="0"/>
           <w:color w:val="auto"/>
           <w:sz w:val="28"/>
@@ -4185,7 +4330,7 @@
       </w:pPr>
       <w:r>
         <w:rPr>
-          <w:rFonts w:hint="default" w:ascii="Times New Roman" w:hAnsi="Times New Roman" w:cs="Times New Roman"/>
+          <w:rFonts w:hint="default" w:ascii="Arial" w:hAnsi="Arial" w:cs="Times New Roman"/>
           <w:color w:val="auto"/>
           <w:sz w:val="28"/>
           <w:szCs w:val="28"/>
@@ -4206,7 +4351,7 @@
       </w:pPr>
       <w:r>
         <w:rPr>
-          <w:rFonts w:hint="default" w:ascii="Times New Roman" w:hAnsi="Times New Roman" w:cs="Times New Roman"/>
+          <w:rFonts w:hint="default" w:ascii="Arial" w:hAnsi="Arial" w:cs="Times New Roman"/>
           <w:color w:val="auto"/>
           <w:sz w:val="28"/>
           <w:szCs w:val="28"/>
@@ -4227,7 +4372,7 @@
       </w:pPr>
       <w:r>
         <w:rPr>
-          <w:rFonts w:hint="default" w:ascii="Times New Roman" w:hAnsi="Times New Roman" w:cs="Times New Roman"/>
+          <w:rFonts w:hint="default" w:ascii="Arial" w:hAnsi="Arial" w:cs="Times New Roman"/>
           <w:color w:val="auto"/>
           <w:sz w:val="28"/>
           <w:szCs w:val="28"/>
@@ -4248,7 +4393,7 @@
       </w:pPr>
       <w:r>
         <w:rPr>
-          <w:rFonts w:hint="default" w:ascii="Times New Roman" w:hAnsi="Times New Roman" w:cs="Times New Roman"/>
+          <w:rFonts w:hint="default" w:ascii="Arial" w:hAnsi="Arial" w:cs="Times New Roman"/>
           <w:color w:val="auto"/>
           <w:sz w:val="28"/>
           <w:szCs w:val="28"/>
@@ -4268,7 +4413,7 @@
       </w:pPr>
       <w:r>
         <w:rPr>
-          <w:rFonts w:hint="default" w:ascii="Times New Roman" w:hAnsi="Times New Roman" w:cs="Times New Roman"/>
+          <w:rFonts w:hint="default" w:ascii="Arial" w:hAnsi="Arial" w:cs="Times New Roman"/>
           <w:b w:val="0"/>
           <w:color w:val="auto"/>
           <w:sz w:val="28"/>
@@ -4289,7 +4434,7 @@
       </w:pPr>
       <w:r>
         <w:rPr>
-          <w:rFonts w:hint="default" w:ascii="Times New Roman" w:hAnsi="Times New Roman" w:cs="Times New Roman"/>
+          <w:rFonts w:hint="default" w:ascii="Arial" w:hAnsi="Arial" w:cs="Times New Roman"/>
           <w:b w:val="0"/>
           <w:color w:val="auto"/>
           <w:sz w:val="28"/>
@@ -4310,7 +4455,7 @@
       </w:pPr>
       <w:r>
         <w:rPr>
-          <w:rFonts w:hint="default" w:ascii="Times New Roman" w:hAnsi="Times New Roman" w:cs="Times New Roman"/>
+          <w:rFonts w:hint="default" w:ascii="Arial" w:hAnsi="Arial" w:cs="Times New Roman"/>
           <w:b w:val="0"/>
           <w:color w:val="auto"/>
           <w:sz w:val="28"/>
@@ -4331,7 +4476,7 @@
       </w:pPr>
       <w:r>
         <w:rPr>
-          <w:rFonts w:hint="default" w:ascii="Times New Roman" w:hAnsi="Times New Roman" w:cs="Times New Roman"/>
+          <w:rFonts w:hint="default" w:ascii="Arial" w:hAnsi="Arial" w:cs="Times New Roman"/>
           <w:b w:val="0"/>
           <w:color w:val="auto"/>
           <w:sz w:val="28"/>
@@ -4352,7 +4497,7 @@
       </w:pPr>
       <w:r>
         <w:rPr>
-          <w:rFonts w:hint="default" w:ascii="Times New Roman" w:hAnsi="Times New Roman" w:cs="Times New Roman"/>
+          <w:rFonts w:hint="default" w:ascii="Arial" w:hAnsi="Arial" w:cs="Times New Roman"/>
           <w:b w:val="0"/>
           <w:color w:val="auto"/>
           <w:sz w:val="28"/>
@@ -4373,13 +4518,13 @@
       </w:pPr>
       <w:r>
         <w:rPr>
-          <w:rFonts w:hint="default" w:ascii="Times New Roman" w:hAnsi="Times New Roman" w:cs="Times New Roman"/>
+          <w:rFonts w:hint="default" w:ascii="Arial" w:hAnsi="Arial" w:cs="Times New Roman"/>
           <w:b w:val="0"/>
           <w:color w:val="auto"/>
           <w:sz w:val="28"/>
           <w:szCs w:val="28"/>
         </w:rPr>
-        <w:t>Обоснование: для устройства с высокими требованиями к надёжности целесообразно микроядро. Минимум кода работает с максимальными привилегиями, поэтому ошибка в драйвере или службе не приводит к краху системы. Компоненты изолированы и их можно заменять и перезапускать по отдельности. Платой за это становится некоторое снижение скорости из‑за обмена сообщениями.</w:t>
+        <w:t>Обоснование: для такого устройства лучше подходит микроядро. В привилегированном режиме работает минимум кода, поэтому сбой драйвера или службы не обрушит всю систему. Компоненты изолированы, их можно заменять и перезапускать независимо. Цена — небольшая потеря скорости из-за обмена сообщениями между процессами.</w:t>
       </w:r>
     </w:p>
     <w:p>
@@ -4394,7 +4539,7 @@
       </w:pPr>
       <w:r>
         <w:rPr>
-          <w:rFonts w:hint="default" w:ascii="Times New Roman" w:hAnsi="Times New Roman" w:cs="Times New Roman"/>
+          <w:rFonts w:hint="default" w:ascii="Arial" w:hAnsi="Arial" w:cs="Times New Roman"/>
           <w:color w:val="auto"/>
           <w:sz w:val="28"/>
           <w:szCs w:val="28"/>
@@ -4414,7 +4559,7 @@
       </w:pPr>
       <w:r>
         <w:rPr>
-          <w:rFonts w:hint="default" w:ascii="Times New Roman" w:hAnsi="Times New Roman" w:cs="Times New Roman"/>
+          <w:rFonts w:hint="default" w:ascii="Arial" w:hAnsi="Arial" w:cs="Times New Roman"/>
           <w:b/>
           <w:color w:val="auto"/>
           <w:sz w:val="28"/>
@@ -4435,7 +4580,7 @@
       </w:pPr>
       <w:r>
         <w:rPr>
-          <w:rFonts w:hint="default" w:ascii="Times New Roman" w:hAnsi="Times New Roman" w:cs="Times New Roman"/>
+          <w:rFonts w:hint="default" w:ascii="Arial" w:hAnsi="Arial" w:cs="Times New Roman"/>
           <w:b w:val="0"/>
           <w:color w:val="auto"/>
           <w:sz w:val="28"/>
@@ -4456,7 +4601,7 @@
       </w:pPr>
       <w:r>
         <w:rPr>
-          <w:rFonts w:hint="default" w:ascii="Times New Roman" w:hAnsi="Times New Roman" w:cs="Times New Roman"/>
+          <w:rFonts w:hint="default" w:ascii="Arial" w:hAnsi="Arial" w:cs="Times New Roman"/>
           <w:b w:val="0"/>
           <w:color w:val="auto"/>
           <w:sz w:val="28"/>
@@ -4477,7 +4622,7 @@
       </w:pPr>
       <w:r>
         <w:rPr>
-          <w:rFonts w:hint="default" w:ascii="Times New Roman" w:hAnsi="Times New Roman" w:cs="Times New Roman"/>
+          <w:rFonts w:hint="default" w:ascii="Arial" w:hAnsi="Arial" w:cs="Times New Roman"/>
           <w:b w:val="0"/>
           <w:color w:val="auto"/>
           <w:sz w:val="28"/>
@@ -4498,7 +4643,7 @@
       </w:pPr>
       <w:r>
         <w:rPr>
-          <w:rFonts w:hint="default" w:ascii="Times New Roman" w:hAnsi="Times New Roman" w:cs="Times New Roman"/>
+          <w:rFonts w:hint="default" w:ascii="Arial" w:hAnsi="Arial" w:cs="Times New Roman"/>
           <w:b w:val="0"/>
           <w:color w:val="auto"/>
           <w:sz w:val="28"/>
@@ -4519,7 +4664,7 @@
       </w:pPr>
       <w:r>
         <w:rPr>
-          <w:rFonts w:hint="default" w:ascii="Times New Roman" w:hAnsi="Times New Roman" w:cs="Times New Roman"/>
+          <w:rFonts w:hint="default" w:ascii="Arial" w:hAnsi="Arial" w:cs="Times New Roman"/>
           <w:b/>
           <w:color w:val="auto"/>
           <w:sz w:val="28"/>
@@ -4540,7 +4685,7 @@
       </w:pPr>
       <w:r>
         <w:rPr>
-          <w:rFonts w:hint="default" w:ascii="Times New Roman" w:hAnsi="Times New Roman" w:cs="Times New Roman"/>
+          <w:rFonts w:hint="default" w:ascii="Arial" w:hAnsi="Arial" w:cs="Times New Roman"/>
           <w:b w:val="0"/>
           <w:color w:val="auto"/>
           <w:sz w:val="28"/>
@@ -4561,7 +4706,7 @@
       </w:pPr>
       <w:r>
         <w:rPr>
-          <w:rFonts w:hint="default" w:ascii="Times New Roman" w:hAnsi="Times New Roman" w:cs="Times New Roman"/>
+          <w:rFonts w:hint="default" w:ascii="Arial" w:hAnsi="Arial" w:cs="Times New Roman"/>
           <w:b w:val="0"/>
           <w:color w:val="auto"/>
           <w:sz w:val="28"/>
@@ -4582,7 +4727,7 @@
       </w:pPr>
       <w:r>
         <w:rPr>
-          <w:rFonts w:hint="default" w:ascii="Times New Roman" w:hAnsi="Times New Roman" w:cs="Times New Roman"/>
+          <w:rFonts w:hint="default" w:ascii="Arial" w:hAnsi="Arial" w:cs="Times New Roman"/>
           <w:b w:val="0"/>
           <w:color w:val="auto"/>
           <w:sz w:val="28"/>
@@ -4603,7 +4748,7 @@
       </w:pPr>
       <w:r>
         <w:rPr>
-          <w:rFonts w:hint="default" w:ascii="Times New Roman" w:hAnsi="Times New Roman" w:cs="Times New Roman"/>
+          <w:rFonts w:hint="default" w:ascii="Arial" w:hAnsi="Arial" w:cs="Times New Roman"/>
           <w:b w:val="0"/>
           <w:color w:val="auto"/>
           <w:sz w:val="28"/>
@@ -4624,7 +4769,7 @@
       </w:pPr>
       <w:r>
         <w:rPr>
-          <w:rFonts w:hint="default" w:ascii="Times New Roman" w:hAnsi="Times New Roman" w:cs="Times New Roman"/>
+          <w:rFonts w:hint="default" w:ascii="Arial" w:hAnsi="Arial" w:cs="Times New Roman"/>
           <w:b/>
           <w:color w:val="auto"/>
           <w:sz w:val="28"/>
@@ -4645,7 +4790,7 @@
       </w:pPr>
       <w:r>
         <w:rPr>
-          <w:rFonts w:hint="default" w:ascii="Times New Roman" w:hAnsi="Times New Roman" w:cs="Times New Roman"/>
+          <w:rFonts w:hint="default" w:ascii="Arial" w:hAnsi="Arial" w:cs="Times New Roman"/>
           <w:b w:val="0"/>
           <w:color w:val="auto"/>
           <w:sz w:val="28"/>
@@ -4666,7 +4811,7 @@
       </w:pPr>
       <w:r>
         <w:rPr>
-          <w:rFonts w:hint="default" w:ascii="Times New Roman" w:hAnsi="Times New Roman" w:cs="Times New Roman"/>
+          <w:rFonts w:hint="default" w:ascii="Arial" w:hAnsi="Arial" w:cs="Times New Roman"/>
           <w:b w:val="0"/>
           <w:color w:val="auto"/>
           <w:sz w:val="28"/>
@@ -4687,7 +4832,7 @@
       </w:pPr>
       <w:r>
         <w:rPr>
-          <w:rFonts w:hint="default" w:ascii="Times New Roman" w:hAnsi="Times New Roman" w:cs="Times New Roman"/>
+          <w:rFonts w:hint="default" w:ascii="Arial" w:hAnsi="Arial" w:cs="Times New Roman"/>
           <w:b w:val="0"/>
           <w:color w:val="auto"/>
           <w:sz w:val="28"/>
@@ -4708,7 +4853,7 @@
       </w:pPr>
       <w:r>
         <w:rPr>
-          <w:rFonts w:hint="default" w:ascii="Times New Roman" w:hAnsi="Times New Roman" w:cs="Times New Roman"/>
+          <w:rFonts w:hint="default" w:ascii="Arial" w:hAnsi="Arial" w:cs="Times New Roman"/>
           <w:b w:val="0"/>
           <w:color w:val="auto"/>
           <w:sz w:val="28"/>
@@ -4729,7 +4874,7 @@
       </w:pPr>
       <w:r>
         <w:rPr>
-          <w:rFonts w:hint="default" w:ascii="Times New Roman" w:hAnsi="Times New Roman" w:cs="Times New Roman"/>
+          <w:rFonts w:hint="default" w:ascii="Arial" w:hAnsi="Arial" w:cs="Times New Roman"/>
           <w:b/>
           <w:color w:val="auto"/>
           <w:sz w:val="28"/>
@@ -4750,7 +4895,7 @@
       </w:pPr>
       <w:r>
         <w:rPr>
-          <w:rFonts w:hint="default" w:ascii="Times New Roman" w:hAnsi="Times New Roman" w:cs="Times New Roman"/>
+          <w:rFonts w:hint="default" w:ascii="Arial" w:hAnsi="Arial" w:cs="Times New Roman"/>
           <w:b w:val="0"/>
           <w:color w:val="auto"/>
           <w:sz w:val="28"/>
@@ -4771,7 +4916,7 @@
       </w:pPr>
       <w:r>
         <w:rPr>
-          <w:rFonts w:hint="default" w:ascii="Times New Roman" w:hAnsi="Times New Roman" w:cs="Times New Roman"/>
+          <w:rFonts w:hint="default" w:ascii="Arial" w:hAnsi="Arial" w:cs="Times New Roman"/>
           <w:b w:val="0"/>
           <w:color w:val="auto"/>
           <w:sz w:val="28"/>
@@ -4792,7 +4937,7 @@
       </w:pPr>
       <w:r>
         <w:rPr>
-          <w:rFonts w:hint="default" w:ascii="Times New Roman" w:hAnsi="Times New Roman" w:cs="Times New Roman"/>
+          <w:rFonts w:hint="default" w:ascii="Arial" w:hAnsi="Arial" w:cs="Times New Roman"/>
           <w:b w:val="0"/>
           <w:color w:val="auto"/>
           <w:sz w:val="28"/>
@@ -4813,7 +4958,7 @@
       </w:pPr>
       <w:r>
         <w:rPr>
-          <w:rFonts w:hint="default" w:ascii="Times New Roman" w:hAnsi="Times New Roman" w:cs="Times New Roman"/>
+          <w:rFonts w:hint="default" w:ascii="Arial" w:hAnsi="Arial" w:cs="Times New Roman"/>
           <w:b w:val="0"/>
           <w:color w:val="auto"/>
           <w:sz w:val="28"/>
@@ -4834,7 +4979,7 @@
       </w:pPr>
       <w:r>
         <w:rPr>
-          <w:rFonts w:hint="default" w:ascii="Times New Roman" w:hAnsi="Times New Roman" w:cs="Times New Roman"/>
+          <w:rFonts w:hint="default" w:ascii="Arial" w:hAnsi="Arial" w:cs="Times New Roman"/>
           <w:b/>
           <w:color w:val="auto"/>
           <w:sz w:val="28"/>
@@ -4855,7 +5000,7 @@
       </w:pPr>
       <w:r>
         <w:rPr>
-          <w:rFonts w:hint="default" w:ascii="Times New Roman" w:hAnsi="Times New Roman" w:cs="Times New Roman"/>
+          <w:rFonts w:hint="default" w:ascii="Arial" w:hAnsi="Arial" w:cs="Times New Roman"/>
           <w:b w:val="0"/>
           <w:color w:val="auto"/>
           <w:sz w:val="28"/>
@@ -4876,7 +5021,7 @@
       </w:pPr>
       <w:r>
         <w:rPr>
-          <w:rFonts w:hint="default" w:ascii="Times New Roman" w:hAnsi="Times New Roman" w:cs="Times New Roman"/>
+          <w:rFonts w:hint="default" w:ascii="Arial" w:hAnsi="Arial" w:cs="Times New Roman"/>
           <w:b w:val="0"/>
           <w:color w:val="auto"/>
           <w:sz w:val="28"/>
@@ -4897,7 +5042,7 @@
       </w:pPr>
       <w:r>
         <w:rPr>
-          <w:rFonts w:hint="default" w:ascii="Times New Roman" w:hAnsi="Times New Roman" w:cs="Times New Roman"/>
+          <w:rFonts w:hint="default" w:ascii="Arial" w:hAnsi="Arial" w:cs="Times New Roman"/>
           <w:b w:val="0"/>
           <w:color w:val="auto"/>
           <w:sz w:val="28"/>
@@ -4918,7 +5063,7 @@
       </w:pPr>
       <w:r>
         <w:rPr>
-          <w:rFonts w:hint="default" w:ascii="Times New Roman" w:hAnsi="Times New Roman" w:cs="Times New Roman"/>
+          <w:rFonts w:hint="default" w:ascii="Arial" w:hAnsi="Arial" w:cs="Times New Roman"/>
           <w:b w:val="0"/>
           <w:color w:val="auto"/>
           <w:sz w:val="28"/>
@@ -4939,7 +5084,7 @@
       </w:pPr>
       <w:r>
         <w:rPr>
-          <w:rFonts w:hint="default" w:ascii="Times New Roman" w:hAnsi="Times New Roman" w:cs="Times New Roman"/>
+          <w:rFonts w:hint="default" w:ascii="Arial" w:hAnsi="Arial" w:cs="Times New Roman"/>
           <w:b/>
           <w:color w:val="auto"/>
           <w:sz w:val="28"/>
@@ -4960,7 +5105,7 @@
       </w:pPr>
       <w:r>
         <w:rPr>
-          <w:rFonts w:hint="default" w:ascii="Times New Roman" w:hAnsi="Times New Roman" w:cs="Times New Roman"/>
+          <w:rFonts w:hint="default" w:ascii="Arial" w:hAnsi="Arial" w:cs="Times New Roman"/>
           <w:b w:val="0"/>
           <w:color w:val="auto"/>
           <w:sz w:val="28"/>
@@ -4981,7 +5126,7 @@
       </w:pPr>
       <w:r>
         <w:rPr>
-          <w:rFonts w:hint="default" w:ascii="Times New Roman" w:hAnsi="Times New Roman" w:cs="Times New Roman"/>
+          <w:rFonts w:hint="default" w:ascii="Arial" w:hAnsi="Arial" w:cs="Times New Roman"/>
           <w:b w:val="0"/>
           <w:color w:val="auto"/>
           <w:sz w:val="28"/>
@@ -5002,7 +5147,7 @@
       </w:pPr>
       <w:r>
         <w:rPr>
-          <w:rFonts w:hint="default" w:ascii="Times New Roman" w:hAnsi="Times New Roman" w:cs="Times New Roman"/>
+          <w:rFonts w:hint="default" w:ascii="Arial" w:hAnsi="Arial" w:cs="Times New Roman"/>
           <w:b w:val="0"/>
           <w:color w:val="auto"/>
           <w:sz w:val="28"/>
@@ -5023,7 +5168,7 @@
       </w:pPr>
       <w:r>
         <w:rPr>
-          <w:rFonts w:hint="default" w:ascii="Times New Roman" w:hAnsi="Times New Roman" w:cs="Times New Roman"/>
+          <w:rFonts w:hint="default" w:ascii="Arial" w:hAnsi="Arial" w:cs="Times New Roman"/>
           <w:b w:val="0"/>
           <w:color w:val="auto"/>
           <w:sz w:val="28"/>
@@ -5044,7 +5189,7 @@
       </w:pPr>
       <w:r>
         <w:rPr>
-          <w:rFonts w:hint="default" w:ascii="Times New Roman" w:hAnsi="Times New Roman" w:cs="Times New Roman"/>
+          <w:rFonts w:hint="default" w:ascii="Arial" w:hAnsi="Arial" w:cs="Times New Roman"/>
           <w:b/>
           <w:color w:val="auto"/>
           <w:sz w:val="28"/>
@@ -5065,7 +5210,7 @@
       </w:pPr>
       <w:r>
         <w:rPr>
-          <w:rFonts w:hint="default" w:ascii="Times New Roman" w:hAnsi="Times New Roman" w:cs="Times New Roman"/>
+          <w:rFonts w:hint="default" w:ascii="Arial" w:hAnsi="Arial" w:cs="Times New Roman"/>
           <w:b w:val="0"/>
           <w:color w:val="auto"/>
           <w:sz w:val="28"/>
@@ -5086,7 +5231,7 @@
       </w:pPr>
       <w:r>
         <w:rPr>
-          <w:rFonts w:hint="default" w:ascii="Times New Roman" w:hAnsi="Times New Roman" w:cs="Times New Roman"/>
+          <w:rFonts w:hint="default" w:ascii="Arial" w:hAnsi="Arial" w:cs="Times New Roman"/>
           <w:b w:val="0"/>
           <w:color w:val="auto"/>
           <w:sz w:val="28"/>
@@ -5107,7 +5252,7 @@
       </w:pPr>
       <w:r>
         <w:rPr>
-          <w:rFonts w:hint="default" w:ascii="Times New Roman" w:hAnsi="Times New Roman" w:cs="Times New Roman"/>
+          <w:rFonts w:hint="default" w:ascii="Arial" w:hAnsi="Arial" w:cs="Times New Roman"/>
           <w:b w:val="0"/>
           <w:color w:val="auto"/>
           <w:sz w:val="28"/>
@@ -5128,7 +5273,7 @@
       </w:pPr>
       <w:r>
         <w:rPr>
-          <w:rFonts w:hint="default" w:ascii="Times New Roman" w:hAnsi="Times New Roman" w:cs="Times New Roman"/>
+          <w:rFonts w:hint="default" w:ascii="Arial" w:hAnsi="Arial" w:cs="Times New Roman"/>
           <w:b w:val="0"/>
           <w:color w:val="auto"/>
           <w:sz w:val="28"/>
@@ -5149,7 +5294,7 @@
       </w:pPr>
       <w:r>
         <w:rPr>
-          <w:rFonts w:hint="default" w:ascii="Times New Roman" w:hAnsi="Times New Roman" w:cs="Times New Roman"/>
+          <w:rFonts w:hint="default" w:ascii="Arial" w:hAnsi="Arial" w:cs="Times New Roman"/>
           <w:b/>
           <w:color w:val="auto"/>
           <w:sz w:val="28"/>
@@ -5170,7 +5315,7 @@
       </w:pPr>
       <w:r>
         <w:rPr>
-          <w:rFonts w:hint="default" w:ascii="Times New Roman" w:hAnsi="Times New Roman" w:cs="Times New Roman"/>
+          <w:rFonts w:hint="default" w:ascii="Arial" w:hAnsi="Arial" w:cs="Times New Roman"/>
           <w:b w:val="0"/>
           <w:color w:val="auto"/>
           <w:sz w:val="28"/>
@@ -5191,7 +5336,7 @@
       </w:pPr>
       <w:r>
         <w:rPr>
-          <w:rFonts w:hint="default" w:ascii="Times New Roman" w:hAnsi="Times New Roman" w:cs="Times New Roman"/>
+          <w:rFonts w:hint="default" w:ascii="Arial" w:hAnsi="Arial" w:cs="Times New Roman"/>
           <w:b w:val="0"/>
           <w:color w:val="auto"/>
           <w:sz w:val="28"/>
@@ -5212,7 +5357,7 @@
       </w:pPr>
       <w:r>
         <w:rPr>
-          <w:rFonts w:hint="default" w:ascii="Times New Roman" w:hAnsi="Times New Roman" w:cs="Times New Roman"/>
+          <w:rFonts w:hint="default" w:ascii="Arial" w:hAnsi="Arial" w:cs="Times New Roman"/>
           <w:b w:val="0"/>
           <w:color w:val="auto"/>
           <w:sz w:val="28"/>
@@ -5233,7 +5378,7 @@
       </w:pPr>
       <w:r>
         <w:rPr>
-          <w:rFonts w:hint="default" w:ascii="Times New Roman" w:hAnsi="Times New Roman" w:cs="Times New Roman"/>
+          <w:rFonts w:hint="default" w:ascii="Arial" w:hAnsi="Arial" w:cs="Times New Roman"/>
           <w:b w:val="0"/>
           <w:color w:val="auto"/>
           <w:sz w:val="28"/>
@@ -5254,7 +5399,7 @@
       </w:pPr>
       <w:r>
         <w:rPr>
-          <w:rFonts w:hint="default" w:ascii="Times New Roman" w:hAnsi="Times New Roman" w:cs="Times New Roman"/>
+          <w:rFonts w:hint="default" w:ascii="Arial" w:hAnsi="Arial" w:cs="Times New Roman"/>
           <w:b/>
           <w:color w:val="auto"/>
           <w:sz w:val="28"/>
@@ -5275,7 +5420,7 @@
       </w:pPr>
       <w:r>
         <w:rPr>
-          <w:rFonts w:hint="default" w:ascii="Times New Roman" w:hAnsi="Times New Roman" w:cs="Times New Roman"/>
+          <w:rFonts w:hint="default" w:ascii="Arial" w:hAnsi="Arial" w:cs="Times New Roman"/>
           <w:b w:val="0"/>
           <w:color w:val="auto"/>
           <w:sz w:val="28"/>
@@ -5296,7 +5441,7 @@
       </w:pPr>
       <w:r>
         <w:rPr>
-          <w:rFonts w:hint="default" w:ascii="Times New Roman" w:hAnsi="Times New Roman" w:cs="Times New Roman"/>
+          <w:rFonts w:hint="default" w:ascii="Arial" w:hAnsi="Arial" w:cs="Times New Roman"/>
           <w:b w:val="0"/>
           <w:color w:val="auto"/>
           <w:sz w:val="28"/>
@@ -5317,7 +5462,7 @@
       </w:pPr>
       <w:r>
         <w:rPr>
-          <w:rFonts w:hint="default" w:ascii="Times New Roman" w:hAnsi="Times New Roman" w:cs="Times New Roman"/>
+          <w:rFonts w:hint="default" w:ascii="Arial" w:hAnsi="Arial" w:cs="Times New Roman"/>
           <w:b w:val="0"/>
           <w:color w:val="auto"/>
           <w:sz w:val="28"/>
@@ -5338,7 +5483,7 @@
       </w:pPr>
       <w:r>
         <w:rPr>
-          <w:rFonts w:hint="default" w:ascii="Times New Roman" w:hAnsi="Times New Roman" w:cs="Times New Roman"/>
+          <w:rFonts w:hint="default" w:ascii="Arial" w:hAnsi="Arial" w:cs="Times New Roman"/>
           <w:b w:val="0"/>
           <w:color w:val="auto"/>
           <w:sz w:val="28"/>
@@ -5359,7 +5504,7 @@
       </w:pPr>
       <w:r>
         <w:rPr>
-          <w:rFonts w:hint="default" w:ascii="Times New Roman" w:hAnsi="Times New Roman" w:cs="Times New Roman"/>
+          <w:rFonts w:hint="default" w:ascii="Arial" w:hAnsi="Arial" w:cs="Times New Roman"/>
           <w:b/>
           <w:color w:val="auto"/>
           <w:sz w:val="28"/>
@@ -5380,7 +5525,7 @@
       </w:pPr>
       <w:r>
         <w:rPr>
-          <w:rFonts w:hint="default" w:ascii="Times New Roman" w:hAnsi="Times New Roman" w:cs="Times New Roman"/>
+          <w:rFonts w:hint="default" w:ascii="Arial" w:hAnsi="Arial" w:cs="Times New Roman"/>
           <w:b w:val="0"/>
           <w:color w:val="auto"/>
           <w:sz w:val="28"/>
@@ -5401,7 +5546,7 @@
       </w:pPr>
       <w:r>
         <w:rPr>
-          <w:rFonts w:hint="default" w:ascii="Times New Roman" w:hAnsi="Times New Roman" w:cs="Times New Roman"/>
+          <w:rFonts w:hint="default" w:ascii="Arial" w:hAnsi="Arial" w:cs="Times New Roman"/>
           <w:b w:val="0"/>
           <w:color w:val="auto"/>
           <w:sz w:val="28"/>
@@ -5422,7 +5567,7 @@
       </w:pPr>
       <w:r>
         <w:rPr>
-          <w:rFonts w:hint="default" w:ascii="Times New Roman" w:hAnsi="Times New Roman" w:cs="Times New Roman"/>
+          <w:rFonts w:hint="default" w:ascii="Arial" w:hAnsi="Arial" w:cs="Times New Roman"/>
           <w:b w:val="0"/>
           <w:color w:val="auto"/>
           <w:sz w:val="28"/>
@@ -5443,7 +5588,7 @@
       </w:pPr>
       <w:r>
         <w:rPr>
-          <w:rFonts w:hint="default" w:ascii="Times New Roman" w:hAnsi="Times New Roman" w:cs="Times New Roman"/>
+          <w:rFonts w:hint="default" w:ascii="Arial" w:hAnsi="Arial" w:cs="Times New Roman"/>
           <w:b w:val="0"/>
           <w:color w:val="auto"/>
           <w:sz w:val="28"/>
@@ -5464,7 +5609,7 @@
       </w:pPr>
       <w:r>
         <w:rPr>
-          <w:rFonts w:hint="default" w:ascii="Times New Roman" w:hAnsi="Times New Roman" w:cs="Times New Roman"/>
+          <w:rFonts w:hint="default" w:ascii="Arial" w:hAnsi="Arial" w:cs="Times New Roman"/>
           <w:b/>
           <w:color w:val="auto"/>
           <w:sz w:val="28"/>
@@ -5474,6 +5619,7 @@
       </w:r>
       <w:r>
         <w:rPr>
+          <w:rFonts w:ascii="Arial" w:hAnsi="Arial"/>
           <w:b w:val="0"/>
         </w:rPr>
         <w:t>1-Б, 2-В, 3-Б, 4-Б, 5-Б, 6-В, 7-Б, 8-Б, 9-А, 10-Б.</w:t>
@@ -5491,7 +5637,7 @@
       </w:pPr>
       <w:r>
         <w:rPr>
-          <w:rFonts w:hint="default" w:ascii="Times New Roman" w:hAnsi="Times New Roman" w:cs="Times New Roman"/>
+          <w:rFonts w:hint="default" w:ascii="Arial" w:hAnsi="Arial" w:cs="Times New Roman"/>
           <w:color w:val="auto"/>
           <w:sz w:val="28"/>
           <w:szCs w:val="28"/>
@@ -5511,7 +5657,7 @@
       </w:pPr>
       <w:r>
         <w:rPr>
-          <w:rFonts w:hint="default" w:ascii="Times New Roman" w:hAnsi="Times New Roman" w:cs="Times New Roman"/>
+          <w:rFonts w:hint="default" w:ascii="Arial" w:hAnsi="Arial" w:cs="Times New Roman"/>
           <w:b w:val="0"/>
           <w:color w:val="auto"/>
           <w:sz w:val="28"/>
@@ -5533,7 +5679,7 @@
       </w:pPr>
       <w:r>
         <w:rPr>
-          <w:rFonts w:hint="default" w:ascii="Times New Roman" w:hAnsi="Times New Roman" w:cs="Times New Roman"/>
+          <w:rFonts w:hint="default" w:ascii="Arial" w:hAnsi="Arial" w:cs="Times New Roman"/>
           <w:b/>
           <w:color w:val="auto"/>
           <w:sz w:val="28"/>
@@ -5554,7 +5700,7 @@
       </w:pPr>
       <w:r>
         <w:rPr>
-          <w:rFonts w:hint="default" w:ascii="Times New Roman" w:hAnsi="Times New Roman" w:cs="Times New Roman"/>
+          <w:rFonts w:hint="default" w:ascii="Arial" w:hAnsi="Arial" w:cs="Times New Roman"/>
           <w:b w:val="0"/>
           <w:color w:val="auto"/>
           <w:sz w:val="28"/>
@@ -5575,7 +5721,7 @@
       </w:pPr>
       <w:r>
         <w:rPr>
-          <w:rFonts w:hint="default" w:ascii="Times New Roman" w:hAnsi="Times New Roman" w:cs="Times New Roman"/>
+          <w:rFonts w:hint="default" w:ascii="Arial" w:hAnsi="Arial" w:cs="Times New Roman"/>
           <w:b w:val="0"/>
           <w:color w:val="auto"/>
           <w:sz w:val="28"/>
@@ -5596,7 +5742,7 @@
       </w:pPr>
       <w:r>
         <w:rPr>
-          <w:rFonts w:hint="default" w:ascii="Times New Roman" w:hAnsi="Times New Roman" w:cs="Times New Roman"/>
+          <w:rFonts w:hint="default" w:ascii="Arial" w:hAnsi="Arial" w:cs="Times New Roman"/>
           <w:b w:val="0"/>
           <w:color w:val="auto"/>
           <w:sz w:val="28"/>
@@ -5617,7 +5763,7 @@
       </w:pPr>
       <w:r>
         <w:rPr>
-          <w:rFonts w:hint="default" w:ascii="Times New Roman" w:hAnsi="Times New Roman" w:cs="Times New Roman"/>
+          <w:rFonts w:hint="default" w:ascii="Arial" w:hAnsi="Arial" w:cs="Times New Roman"/>
           <w:b w:val="0"/>
           <w:color w:val="auto"/>
           <w:sz w:val="28"/>
@@ -5638,7 +5784,7 @@
       </w:pPr>
       <w:r>
         <w:rPr>
-          <w:rFonts w:hint="default" w:ascii="Times New Roman" w:hAnsi="Times New Roman" w:cs="Times New Roman"/>
+          <w:rFonts w:hint="default" w:ascii="Arial" w:hAnsi="Arial" w:cs="Times New Roman"/>
           <w:b w:val="0"/>
           <w:color w:val="auto"/>
           <w:sz w:val="28"/>
@@ -5659,7 +5805,7 @@
       </w:pPr>
       <w:r>
         <w:rPr>
-          <w:rFonts w:hint="default" w:ascii="Times New Roman" w:hAnsi="Times New Roman" w:cs="Times New Roman"/>
+          <w:rFonts w:hint="default" w:ascii="Arial" w:hAnsi="Arial" w:cs="Times New Roman"/>
           <w:b w:val="0"/>
           <w:color w:val="auto"/>
           <w:sz w:val="28"/>
@@ -5680,7 +5826,7 @@
       </w:pPr>
       <w:r>
         <w:rPr>
-          <w:rFonts w:hint="default" w:ascii="Times New Roman" w:hAnsi="Times New Roman" w:cs="Times New Roman"/>
+          <w:rFonts w:hint="default" w:ascii="Arial" w:hAnsi="Arial" w:cs="Times New Roman"/>
           <w:b w:val="0"/>
           <w:color w:val="auto"/>
           <w:sz w:val="28"/>
@@ -5701,7 +5847,7 @@
       </w:pPr>
       <w:r>
         <w:rPr>
-          <w:rFonts w:hint="default" w:ascii="Times New Roman" w:hAnsi="Times New Roman" w:cs="Times New Roman"/>
+          <w:rFonts w:hint="default" w:ascii="Arial" w:hAnsi="Arial" w:cs="Times New Roman"/>
           <w:b w:val="0"/>
           <w:color w:val="auto"/>
           <w:sz w:val="28"/>
@@ -5722,7 +5868,7 @@
       </w:pPr>
       <w:r>
         <w:rPr>
-          <w:rFonts w:hint="default" w:ascii="Times New Roman" w:hAnsi="Times New Roman" w:cs="Times New Roman"/>
+          <w:rFonts w:hint="default" w:ascii="Arial" w:hAnsi="Arial" w:cs="Times New Roman"/>
           <w:b w:val="0"/>
           <w:color w:val="auto"/>
           <w:sz w:val="28"/>
@@ -5743,7 +5889,7 @@
       </w:pPr>
       <w:r>
         <w:rPr>
-          <w:rFonts w:hint="default" w:ascii="Times New Roman" w:hAnsi="Times New Roman" w:cs="Times New Roman"/>
+          <w:rFonts w:hint="default" w:ascii="Arial" w:hAnsi="Arial" w:cs="Times New Roman"/>
           <w:b w:val="0"/>
           <w:color w:val="auto"/>
           <w:sz w:val="28"/>
@@ -5764,7 +5910,7 @@
       </w:pPr>
       <w:r>
         <w:rPr>
-          <w:rFonts w:hint="default" w:ascii="Times New Roman" w:hAnsi="Times New Roman" w:cs="Times New Roman"/>
+          <w:rFonts w:hint="default" w:ascii="Arial" w:hAnsi="Arial" w:cs="Times New Roman"/>
           <w:b w:val="0"/>
           <w:color w:val="auto"/>
           <w:sz w:val="28"/>
@@ -5785,13 +5931,13 @@
       </w:pPr>
       <w:r>
         <w:rPr>
-          <w:rFonts w:hint="default" w:ascii="Times New Roman" w:hAnsi="Times New Roman" w:cs="Times New Roman"/>
+          <w:rFonts w:hint="default" w:ascii="Arial" w:hAnsi="Arial" w:cs="Times New Roman"/>
           <w:b w:val="0"/>
           <w:color w:val="auto"/>
           <w:sz w:val="28"/>
           <w:szCs w:val="28"/>
         </w:rPr>
-        <w:t>Пример: печать документа. Пользователь нажимает «Печать» в текстовом редакторе → редактор вызывает функцию печати через API → системный вызов передаёт запрос в ядро → ядро ставит задание в очередь печати → драйвер принтера преобразует данные в команды → принтер печатает страницу.</w:t>
+        <w:t>Пример: чтение файла с диска. Пользователь открывает файл в текстовом редакторе → редактор вызывает функцию чтения через API → системный вызов передаёт запрос в ядро → файловая система находит нужные блоки → драйвер диска формирует команды → SSD/HDD отдаёт данные, которые попадают в редактор.</w:t>
       </w:r>
     </w:p>
     <w:p>
@@ -5806,7 +5952,7 @@
       </w:pPr>
       <w:r>
         <w:rPr>
-          <w:rFonts w:hint="default" w:ascii="Times New Roman" w:hAnsi="Times New Roman" w:cs="Times New Roman"/>
+          <w:rFonts w:hint="default" w:ascii="Arial" w:hAnsi="Arial" w:cs="Times New Roman"/>
           <w:color w:val="auto"/>
           <w:sz w:val="28"/>
           <w:szCs w:val="28"/>
@@ -5826,7 +5972,7 @@
       </w:pPr>
       <w:r>
         <w:rPr>
-          <w:rFonts w:hint="default" w:ascii="Times New Roman" w:hAnsi="Times New Roman" w:cs="Times New Roman"/>
+          <w:rFonts w:hint="default" w:ascii="Arial" w:hAnsi="Arial" w:cs="Times New Roman"/>
           <w:b w:val="0"/>
           <w:color w:val="auto"/>
           <w:sz w:val="28"/>
@@ -5836,6 +5982,7 @@
       </w:r>
       <w:r>
         <w:rPr>
+          <w:rFonts w:ascii="Arial" w:hAnsi="Arial"/>
           <w:b w:val="0"/>
         </w:rPr>
         <w:br/>
@@ -5854,7 +6001,7 @@
       </w:pPr>
       <w:r>
         <w:rPr>
-          <w:rFonts w:hint="default" w:ascii="Times New Roman" w:hAnsi="Times New Roman" w:cs="Times New Roman"/>
+          <w:rFonts w:hint="default" w:ascii="Arial" w:hAnsi="Arial" w:cs="Times New Roman"/>
           <w:b w:val="0"/>
           <w:color w:val="auto"/>
           <w:sz w:val="28"/>
@@ -5864,6 +6011,7 @@
       </w:r>
       <w:r>
         <w:rPr>
+          <w:rFonts w:ascii="Arial" w:hAnsi="Arial"/>
           <w:b w:val="0"/>
         </w:rPr>
         <w:br/>
@@ -5882,7 +6030,7 @@
       </w:pPr>
       <w:r>
         <w:rPr>
-          <w:rFonts w:hint="default" w:ascii="Times New Roman" w:hAnsi="Times New Roman" w:cs="Times New Roman"/>
+          <w:rFonts w:hint="default" w:ascii="Arial" w:hAnsi="Arial" w:cs="Times New Roman"/>
           <w:b w:val="0"/>
           <w:color w:val="auto"/>
           <w:sz w:val="28"/>
@@ -5892,6 +6040,7 @@
       </w:r>
       <w:r>
         <w:rPr>
+          <w:rFonts w:ascii="Arial" w:hAnsi="Arial"/>
           <w:b w:val="0"/>
         </w:rPr>
         <w:br/>
@@ -5910,7 +6059,7 @@
       </w:pPr>
       <w:r>
         <w:rPr>
-          <w:rFonts w:hint="default" w:ascii="Times New Roman" w:hAnsi="Times New Roman" w:cs="Times New Roman"/>
+          <w:rFonts w:hint="default" w:ascii="Arial" w:hAnsi="Arial" w:cs="Times New Roman"/>
           <w:b w:val="0"/>
           <w:color w:val="auto"/>
           <w:sz w:val="28"/>
@@ -5920,6 +6069,7 @@
       </w:r>
       <w:r>
         <w:rPr>
+          <w:rFonts w:ascii="Arial" w:hAnsi="Arial"/>
           <w:b w:val="0"/>
         </w:rPr>
         <w:br/>
@@ -5938,7 +6088,7 @@
       </w:pPr>
       <w:r>
         <w:rPr>
-          <w:rFonts w:hint="default" w:ascii="Times New Roman" w:hAnsi="Times New Roman" w:cs="Times New Roman"/>
+          <w:rFonts w:hint="default" w:ascii="Arial" w:hAnsi="Arial" w:cs="Times New Roman"/>
           <w:b w:val="0"/>
           <w:color w:val="auto"/>
           <w:sz w:val="28"/>
@@ -5948,6 +6098,7 @@
       </w:r>
       <w:r>
         <w:rPr>
+          <w:rFonts w:ascii="Arial" w:hAnsi="Arial"/>
           <w:b w:val="0"/>
         </w:rPr>
         <w:br/>
@@ -5966,7 +6117,7 @@
       </w:pPr>
       <w:r>
         <w:rPr>
-          <w:rFonts w:hint="default" w:ascii="Times New Roman" w:hAnsi="Times New Roman" w:cs="Times New Roman"/>
+          <w:rFonts w:hint="default" w:ascii="Arial" w:hAnsi="Arial" w:cs="Times New Roman"/>
           <w:b w:val="0"/>
           <w:color w:val="auto"/>
           <w:sz w:val="28"/>
@@ -5976,6 +6127,7 @@
       </w:r>
       <w:r>
         <w:rPr>
+          <w:rFonts w:ascii="Arial" w:hAnsi="Arial"/>
           <w:b w:val="0"/>
         </w:rPr>
         <w:br/>
@@ -5994,7 +6146,7 @@
       </w:pPr>
       <w:r>
         <w:rPr>
-          <w:rFonts w:hint="default" w:ascii="Times New Roman" w:hAnsi="Times New Roman" w:cs="Times New Roman"/>
+          <w:rFonts w:hint="default" w:ascii="Arial" w:hAnsi="Arial" w:cs="Times New Roman"/>
           <w:b w:val="0"/>
           <w:color w:val="auto"/>
           <w:sz w:val="28"/>
@@ -6004,6 +6156,7 @@
       </w:r>
       <w:r>
         <w:rPr>
+          <w:rFonts w:ascii="Arial" w:hAnsi="Arial"/>
           <w:b w:val="0"/>
         </w:rPr>
         <w:br/>
@@ -6022,7 +6175,7 @@
       </w:pPr>
       <w:r>
         <w:rPr>
-          <w:rFonts w:hint="default" w:ascii="Times New Roman" w:hAnsi="Times New Roman" w:cs="Times New Roman"/>
+          <w:rFonts w:hint="default" w:ascii="Arial" w:hAnsi="Arial" w:cs="Times New Roman"/>
           <w:b w:val="0"/>
           <w:color w:val="auto"/>
           <w:sz w:val="28"/>
@@ -6032,6 +6185,7 @@
       </w:r>
       <w:r>
         <w:rPr>
+          <w:rFonts w:ascii="Arial" w:hAnsi="Arial"/>
           <w:b w:val="0"/>
         </w:rPr>
         <w:br/>
@@ -6050,7 +6204,7 @@
       </w:pPr>
       <w:r>
         <w:rPr>
-          <w:rFonts w:hint="default" w:ascii="Times New Roman" w:hAnsi="Times New Roman" w:cs="Times New Roman"/>
+          <w:rFonts w:hint="default" w:ascii="Arial" w:hAnsi="Arial" w:cs="Times New Roman"/>
           <w:b w:val="0"/>
           <w:color w:val="auto"/>
           <w:sz w:val="28"/>
@@ -6060,6 +6214,7 @@
       </w:r>
       <w:r>
         <w:rPr>
+          <w:rFonts w:ascii="Arial" w:hAnsi="Arial"/>
           <w:b w:val="0"/>
         </w:rPr>
         <w:br/>
@@ -6078,7 +6233,7 @@
       </w:pPr>
       <w:r>
         <w:rPr>
-          <w:rFonts w:hint="default" w:ascii="Times New Roman" w:hAnsi="Times New Roman" w:cs="Times New Roman"/>
+          <w:rFonts w:hint="default" w:ascii="Arial" w:hAnsi="Arial" w:cs="Times New Roman"/>
           <w:b w:val="0"/>
           <w:color w:val="auto"/>
           <w:sz w:val="28"/>
@@ -6088,6 +6243,7 @@
       </w:r>
       <w:r>
         <w:rPr>
+          <w:rFonts w:ascii="Arial" w:hAnsi="Arial"/>
           <w:b w:val="0"/>
         </w:rPr>
         <w:br/>
@@ -6106,7 +6262,7 @@
       </w:pPr>
       <w:r>
         <w:rPr>
-          <w:rFonts w:hint="default" w:ascii="Times New Roman" w:hAnsi="Times New Roman" w:cs="Times New Roman"/>
+          <w:rFonts w:hint="default" w:ascii="Arial" w:hAnsi="Arial" w:cs="Times New Roman"/>
           <w:b w:val="0"/>
           <w:color w:val="auto"/>
           <w:sz w:val="28"/>
@@ -6116,7 +6272,7 @@
       </w:r>
       <w:r>
         <w:rPr>
-          <w:rFonts w:hint="default" w:cs="Times New Roman"/>
+          <w:rFonts w:hint="default" w:cs="Times New Roman" w:ascii="Arial" w:hAnsi="Arial"/>
           <w:b w:val="0"/>
           <w:color w:val="auto"/>
           <w:sz w:val="28"/>
@@ -6129,7 +6285,7 @@
       <w:bookmarkEnd w:id="0"/>
       <w:r>
         <w:rPr>
-          <w:rFonts w:hint="default" w:ascii="Times New Roman" w:hAnsi="Times New Roman" w:cs="Times New Roman"/>
+          <w:rFonts w:hint="default" w:ascii="Arial" w:hAnsi="Arial" w:cs="Times New Roman"/>
           <w:b w:val="0"/>
           <w:color w:val="auto"/>
           <w:sz w:val="28"/>
@@ -6139,6 +6295,7 @@
       </w:r>
       <w:r>
         <w:rPr>
+          <w:rFonts w:ascii="Arial" w:hAnsi="Arial"/>
           <w:b w:val="0"/>
         </w:rPr>
         <w:br/>
@@ -6628,7 +6785,7 @@
       <w:spacing w:after="200" w:line="276" w:lineRule="auto"/>
     </w:pPr>
     <w:rPr>
-      <w:rFonts w:ascii="Times New Roman" w:hAnsi="Times New Roman" w:eastAsiaTheme="minorEastAsia" w:cstheme="minorBidi"/>
+      <w:rFonts w:ascii="Arial" w:hAnsi="Arial" w:eastAsiaTheme="minorEastAsia" w:cstheme="minorBidi"/>
       <w:sz w:val="24"/>
       <w:szCs w:val="22"/>
       <w:lang w:val="en-US" w:eastAsia="en-US" w:bidi="ar-SA"/>
@@ -6648,7 +6805,7 @@
       <w:outlineLvl w:val="0"/>
     </w:pPr>
     <w:rPr>
-      <w:rFonts w:asciiTheme="majorHAnsi" w:hAnsiTheme="majorHAnsi" w:eastAsiaTheme="majorEastAsia" w:cstheme="majorBidi"/>
+      <w:rFonts w:asciiTheme="majorHAnsi" w:hAnsiTheme="majorHAnsi" w:eastAsiaTheme="majorEastAsia" w:cstheme="majorBidi" w:ascii="Arial" w:hAnsi="Arial"/>
       <w:b/>
       <w:bCs/>
       <w:color w:val="376092" w:themeColor="accent1" w:themeShade="BF"/>
@@ -6671,7 +6828,7 @@
       <w:outlineLvl w:val="1"/>
     </w:pPr>
     <w:rPr>
-      <w:rFonts w:asciiTheme="majorHAnsi" w:hAnsiTheme="majorHAnsi" w:eastAsiaTheme="majorEastAsia" w:cstheme="majorBidi"/>
+      <w:rFonts w:asciiTheme="majorHAnsi" w:hAnsiTheme="majorHAnsi" w:eastAsiaTheme="majorEastAsia" w:cstheme="majorBidi" w:ascii="Arial" w:hAnsi="Arial"/>
       <w:b/>
       <w:bCs/>
       <w:color w:val="4F81BD" w:themeColor="accent1"/>
@@ -6699,7 +6856,7 @@
       <w:outlineLvl w:val="2"/>
     </w:pPr>
     <w:rPr>
-      <w:rFonts w:asciiTheme="majorHAnsi" w:hAnsiTheme="majorHAnsi" w:eastAsiaTheme="majorEastAsia" w:cstheme="majorBidi"/>
+      <w:rFonts w:asciiTheme="majorHAnsi" w:hAnsiTheme="majorHAnsi" w:eastAsiaTheme="majorEastAsia" w:cstheme="majorBidi" w:ascii="Arial" w:hAnsi="Arial"/>
       <w:b/>
       <w:bCs/>
       <w:color w:val="4F81BD" w:themeColor="accent1"/>
@@ -6726,7 +6883,7 @@
       <w:outlineLvl w:val="3"/>
     </w:pPr>
     <w:rPr>
-      <w:rFonts w:asciiTheme="majorHAnsi" w:hAnsiTheme="majorHAnsi" w:eastAsiaTheme="majorEastAsia" w:cstheme="majorBidi"/>
+      <w:rFonts w:asciiTheme="majorHAnsi" w:hAnsiTheme="majorHAnsi" w:eastAsiaTheme="majorEastAsia" w:cstheme="majorBidi" w:ascii="Arial" w:hAnsi="Arial"/>
       <w:b/>
       <w:bCs/>
       <w:i/>
@@ -6755,7 +6912,7 @@
       <w:outlineLvl w:val="4"/>
     </w:pPr>
     <w:rPr>
-      <w:rFonts w:asciiTheme="majorHAnsi" w:hAnsiTheme="majorHAnsi" w:eastAsiaTheme="majorEastAsia" w:cstheme="majorBidi"/>
+      <w:rFonts w:asciiTheme="majorHAnsi" w:hAnsiTheme="majorHAnsi" w:eastAsiaTheme="majorEastAsia" w:cstheme="majorBidi" w:ascii="Arial" w:hAnsi="Arial"/>
       <w:color w:val="254061" w:themeColor="accent1" w:themeShade="80"/>
     </w:rPr>
   </w:style>
@@ -6775,7 +6932,7 @@
       <w:outlineLvl w:val="5"/>
     </w:pPr>
     <w:rPr>
-      <w:rFonts w:asciiTheme="majorHAnsi" w:hAnsiTheme="majorHAnsi" w:eastAsiaTheme="majorEastAsia" w:cstheme="majorBidi"/>
+      <w:rFonts w:asciiTheme="majorHAnsi" w:hAnsiTheme="majorHAnsi" w:eastAsiaTheme="majorEastAsia" w:cstheme="majorBidi" w:ascii="Arial" w:hAnsi="Arial"/>
       <w:i/>
       <w:iCs/>
       <w:color w:val="254061" w:themeColor="accent1" w:themeShade="80"/>
@@ -6797,7 +6954,7 @@
       <w:outlineLvl w:val="6"/>
     </w:pPr>
     <w:rPr>
-      <w:rFonts w:asciiTheme="majorHAnsi" w:hAnsiTheme="majorHAnsi" w:eastAsiaTheme="majorEastAsia" w:cstheme="majorBidi"/>
+      <w:rFonts w:asciiTheme="majorHAnsi" w:hAnsiTheme="majorHAnsi" w:eastAsiaTheme="majorEastAsia" w:cstheme="majorBidi" w:ascii="Arial" w:hAnsi="Arial"/>
       <w:i/>
       <w:iCs/>
       <w:color w:val="404040" w:themeColor="text1" w:themeTint="BF"/>
@@ -6827,7 +6984,7 @@
       <w:outlineLvl w:val="7"/>
     </w:pPr>
     <w:rPr>
-      <w:rFonts w:asciiTheme="majorHAnsi" w:hAnsiTheme="majorHAnsi" w:eastAsiaTheme="majorEastAsia" w:cstheme="majorBidi"/>
+      <w:rFonts w:asciiTheme="majorHAnsi" w:hAnsiTheme="majorHAnsi" w:eastAsiaTheme="majorEastAsia" w:cstheme="majorBidi" w:ascii="Arial" w:hAnsi="Arial"/>
       <w:color w:val="4F81BD" w:themeColor="accent1"/>
       <w:sz w:val="20"/>
       <w:szCs w:val="20"/>
@@ -6854,7 +7011,7 @@
       <w:outlineLvl w:val="8"/>
     </w:pPr>
     <w:rPr>
-      <w:rFonts w:asciiTheme="majorHAnsi" w:hAnsiTheme="majorHAnsi" w:eastAsiaTheme="majorEastAsia" w:cstheme="majorBidi"/>
+      <w:rFonts w:asciiTheme="majorHAnsi" w:hAnsiTheme="majorHAnsi" w:eastAsiaTheme="majorEastAsia" w:cstheme="majorBidi" w:ascii="Arial" w:hAnsi="Arial"/>
       <w:i/>
       <w:iCs/>
       <w:color w:val="404040" w:themeColor="text1" w:themeTint="BF"/>
@@ -6876,6 +7033,9 @@
     <w:unhideWhenUsed/>
     <w:qFormat/>
     <w:uiPriority w:val="1"/>
+    <w:rPr>
+      <w:rFonts w:ascii="Arial" w:hAnsi="Arial"/>
+    </w:rPr>
   </w:style>
   <w:style w:type="table" w:default="1" w:styleId="12">
     <w:name w:val="Normal Table"/>
@@ -6883,6 +7043,9 @@
     <w:unhideWhenUsed/>
     <w:qFormat/>
     <w:uiPriority w:val="99"/>
+    <w:rPr>
+      <w:rFonts w:ascii="Arial" w:hAnsi="Arial"/>
+    </w:rPr>
     <w:tblPr>
       <w:tblCellMar>
         <w:top w:w="0" w:type="dxa"/>
@@ -6898,6 +7061,7 @@
     <w:qFormat/>
     <w:uiPriority w:val="20"/>
     <w:rPr>
+      <w:rFonts w:ascii="Arial" w:hAnsi="Arial"/>
       <w:i/>
       <w:iCs/>
     </w:rPr>
@@ -6908,6 +7072,7 @@
     <w:qFormat/>
     <w:uiPriority w:val="22"/>
     <w:rPr>
+      <w:rFonts w:ascii="Arial" w:hAnsi="Arial"/>
       <w:b/>
       <w:bCs/>
     </w:rPr>
@@ -6923,6 +7088,9 @@
       <w:ind w:left="360"/>
       <w:contextualSpacing/>
     </w:pPr>
+    <w:rPr>
+      <w:rFonts w:ascii="Arial" w:hAnsi="Arial"/>
+    </w:rPr>
   </w:style>
   <w:style w:type="paragraph" w:styleId="16">
     <w:name w:val="Body Text 2"/>
@@ -6933,6 +7101,9 @@
     <w:pPr>
       <w:spacing w:after="120" w:line="480" w:lineRule="auto"/>
     </w:pPr>
+    <w:rPr>
+      <w:rFonts w:ascii="Arial" w:hAnsi="Arial"/>
+    </w:rPr>
   </w:style>
   <w:style w:type="paragraph" w:styleId="17">
     <w:name w:val="caption"/>
@@ -6946,6 +7117,7 @@
       <w:spacing w:line="240" w:lineRule="auto"/>
     </w:pPr>
     <w:rPr>
+      <w:rFonts w:ascii="Arial" w:hAnsi="Arial"/>
       <w:b/>
       <w:bCs/>
       <w:color w:val="4F81BD" w:themeColor="accent1"/>
@@ -6971,6 +7143,9 @@
       </w:numPr>
       <w:contextualSpacing/>
     </w:pPr>
+    <w:rPr>
+      <w:rFonts w:ascii="Arial" w:hAnsi="Arial"/>
+    </w:rPr>
   </w:style>
   <w:style w:type="paragraph" w:styleId="19">
     <w:name w:val="header"/>
@@ -6985,6 +7160,9 @@
       </w:tabs>
       <w:spacing w:after="0" w:line="240" w:lineRule="auto"/>
     </w:pPr>
+    <w:rPr>
+      <w:rFonts w:ascii="Arial" w:hAnsi="Arial"/>
+    </w:rPr>
   </w:style>
   <w:style w:type="paragraph" w:styleId="20">
     <w:name w:val="Body Text"/>
@@ -6996,6 +7174,9 @@
     <w:pPr>
       <w:spacing w:after="120"/>
     </w:pPr>
+    <w:rPr>
+      <w:rFonts w:ascii="Arial" w:hAnsi="Arial"/>
+    </w:rPr>
   </w:style>
   <w:style w:type="paragraph" w:styleId="21">
     <w:name w:val="macro"/>
@@ -7016,7 +7197,7 @@
       <w:spacing w:after="200" w:line="276" w:lineRule="auto"/>
     </w:pPr>
     <w:rPr>
-      <w:rFonts w:ascii="Courier" w:hAnsi="Courier" w:eastAsiaTheme="minorEastAsia" w:cstheme="minorBidi"/>
+      <w:rFonts w:ascii="Arial" w:hAnsi="Arial" w:eastAsiaTheme="minorEastAsia" w:cstheme="minorBidi"/>
       <w:sz w:val="20"/>
       <w:szCs w:val="20"/>
       <w:lang w:val="en-US" w:eastAsia="en-US" w:bidi="ar-SA"/>
@@ -7035,6 +7216,9 @@
       </w:numPr>
       <w:contextualSpacing/>
     </w:pPr>
+    <w:rPr>
+      <w:rFonts w:ascii="Arial" w:hAnsi="Arial"/>
+    </w:rPr>
   </w:style>
   <w:style w:type="paragraph" w:styleId="23">
     <w:name w:val="List Bullet 2"/>
@@ -7049,6 +7233,9 @@
       </w:numPr>
       <w:contextualSpacing/>
     </w:pPr>
+    <w:rPr>
+      <w:rFonts w:ascii="Arial" w:hAnsi="Arial"/>
+    </w:rPr>
   </w:style>
   <w:style w:type="paragraph" w:styleId="24">
     <w:name w:val="List Bullet 3"/>
@@ -7062,6 +7249,9 @@
       </w:numPr>
       <w:contextualSpacing/>
     </w:pPr>
+    <w:rPr>
+      <w:rFonts w:ascii="Arial" w:hAnsi="Arial"/>
+    </w:rPr>
   </w:style>
   <w:style w:type="paragraph" w:styleId="25">
     <w:name w:val="Title"/>
@@ -7078,7 +7268,7 @@
       <w:contextualSpacing/>
     </w:pPr>
     <w:rPr>
-      <w:rFonts w:asciiTheme="majorHAnsi" w:hAnsiTheme="majorHAnsi" w:eastAsiaTheme="majorEastAsia" w:cstheme="majorBidi"/>
+      <w:rFonts w:asciiTheme="majorHAnsi" w:hAnsiTheme="majorHAnsi" w:eastAsiaTheme="majorEastAsia" w:cstheme="majorBidi" w:ascii="Arial" w:hAnsi="Arial"/>
       <w:color w:val="17375E" w:themeColor="text2" w:themeShade="BF"/>
       <w:spacing w:val="5"/>
       <w:kern w:val="28"/>
@@ -7100,6 +7290,9 @@
       </w:tabs>
       <w:spacing w:after="0" w:line="240" w:lineRule="auto"/>
     </w:pPr>
+    <w:rPr>
+      <w:rFonts w:ascii="Arial" w:hAnsi="Arial"/>
+    </w:rPr>
   </w:style>
   <w:style w:type="paragraph" w:styleId="27">
     <w:name w:val="List Number"/>
@@ -7113,6 +7306,9 @@
       </w:numPr>
       <w:contextualSpacing/>
     </w:pPr>
+    <w:rPr>
+      <w:rFonts w:ascii="Arial" w:hAnsi="Arial"/>
+    </w:rPr>
   </w:style>
   <w:style w:type="paragraph" w:styleId="28">
     <w:name w:val="List Number 2"/>
@@ -7126,6 +7322,9 @@
       </w:numPr>
       <w:contextualSpacing/>
     </w:pPr>
+    <w:rPr>
+      <w:rFonts w:ascii="Arial" w:hAnsi="Arial"/>
+    </w:rPr>
   </w:style>
   <w:style w:type="paragraph" w:styleId="29">
     <w:name w:val="List"/>
@@ -7136,6 +7335,9 @@
       <w:ind w:left="360" w:hanging="360"/>
       <w:contextualSpacing/>
     </w:pPr>
+    <w:rPr>
+      <w:rFonts w:ascii="Arial" w:hAnsi="Arial"/>
+    </w:rPr>
   </w:style>
   <w:style w:type="paragraph" w:styleId="30">
     <w:name w:val="Body Text 3"/>
@@ -7147,6 +7349,7 @@
       <w:spacing w:after="120"/>
     </w:pPr>
     <w:rPr>
+      <w:rFonts w:ascii="Arial" w:hAnsi="Arial"/>
       <w:sz w:val="16"/>
       <w:szCs w:val="16"/>
     </w:rPr>
@@ -7159,7 +7362,7 @@
     <w:qFormat/>
     <w:uiPriority w:val="11"/>
     <w:rPr>
-      <w:rFonts w:asciiTheme="majorHAnsi" w:hAnsiTheme="majorHAnsi" w:eastAsiaTheme="majorEastAsia" w:cstheme="majorBidi"/>
+      <w:rFonts w:asciiTheme="majorHAnsi" w:hAnsiTheme="majorHAnsi" w:eastAsiaTheme="majorEastAsia" w:cstheme="majorBidi" w:ascii="Arial" w:hAnsi="Arial"/>
       <w:i/>
       <w:iCs/>
       <w:color w:val="4F81BD" w:themeColor="accent1"/>
@@ -7184,6 +7387,9 @@
       <w:ind w:left="720"/>
       <w:contextualSpacing/>
     </w:pPr>
+    <w:rPr>
+      <w:rFonts w:ascii="Arial" w:hAnsi="Arial"/>
+    </w:rPr>
   </w:style>
   <w:style w:type="paragraph" w:styleId="33">
     <w:name w:val="List Continue 3"/>
@@ -7195,6 +7401,9 @@
       <w:ind w:left="1080"/>
       <w:contextualSpacing/>
     </w:pPr>
+    <w:rPr>
+      <w:rFonts w:ascii="Arial" w:hAnsi="Arial"/>
+    </w:rPr>
   </w:style>
   <w:style w:type="paragraph" w:styleId="34">
     <w:name w:val="List 2"/>
@@ -7206,6 +7415,9 @@
       <w:ind w:left="720" w:hanging="360"/>
       <w:contextualSpacing/>
     </w:pPr>
+    <w:rPr>
+      <w:rFonts w:ascii="Arial" w:hAnsi="Arial"/>
+    </w:rPr>
   </w:style>
   <w:style w:type="paragraph" w:styleId="35">
     <w:name w:val="List 3"/>
@@ -7216,6 +7428,9 @@
       <w:ind w:left="1080" w:hanging="360"/>
       <w:contextualSpacing/>
     </w:pPr>
+    <w:rPr>
+      <w:rFonts w:ascii="Arial" w:hAnsi="Arial"/>
+    </w:rPr>
   </w:style>
   <w:style w:type="table" w:styleId="36">
     <w:name w:val="Table Grid"/>
@@ -7224,6 +7439,9 @@
     <w:pPr>
       <w:spacing w:after="0" w:line="240" w:lineRule="auto"/>
     </w:pPr>
+    <w:rPr>
+      <w:rFonts w:ascii="Arial" w:hAnsi="Arial"/>
+    </w:rPr>
     <w:tblPr>
       <w:tblBorders>
         <w:top w:val="single" w:color="auto" w:sz="4" w:space="0"/>
@@ -7247,6 +7465,9 @@
     <w:link w:val="19"/>
     <w:qFormat/>
     <w:uiPriority w:val="99"/>
+    <w:rPr>
+      <w:rFonts w:ascii="Arial" w:hAnsi="Arial"/>
+    </w:rPr>
   </w:style>
   <w:style w:type="character" w:customStyle="1" w:styleId="38">
     <w:name w:val="Footer Char"/>
@@ -7254,6 +7475,9 @@
     <w:link w:val="26"/>
     <w:qFormat/>
     <w:uiPriority w:val="99"/>
+    <w:rPr>
+      <w:rFonts w:ascii="Arial" w:hAnsi="Arial"/>
+    </w:rPr>
   </w:style>
   <w:style w:type="paragraph" w:styleId="39">
     <w:name w:val="No Spacing"/>
@@ -7263,7 +7487,7 @@
       <w:spacing w:after="0" w:line="240" w:lineRule="auto"/>
     </w:pPr>
     <w:rPr>
-      <w:rFonts w:asciiTheme="minorHAnsi" w:hAnsiTheme="minorHAnsi" w:eastAsiaTheme="minorEastAsia" w:cstheme="minorBidi"/>
+      <w:rFonts w:asciiTheme="minorHAnsi" w:hAnsiTheme="minorHAnsi" w:eastAsiaTheme="minorEastAsia" w:cstheme="minorBidi" w:ascii="Arial" w:hAnsi="Arial"/>
       <w:sz w:val="22"/>
       <w:szCs w:val="22"/>
       <w:lang w:val="en-US" w:eastAsia="en-US" w:bidi="ar-SA"/>
@@ -7276,7 +7500,7 @@
     <w:qFormat/>
     <w:uiPriority w:val="9"/>
     <w:rPr>
-      <w:rFonts w:asciiTheme="majorHAnsi" w:hAnsiTheme="majorHAnsi" w:eastAsiaTheme="majorEastAsia" w:cstheme="majorBidi"/>
+      <w:rFonts w:asciiTheme="majorHAnsi" w:hAnsiTheme="majorHAnsi" w:eastAsiaTheme="majorEastAsia" w:cstheme="majorBidi" w:ascii="Arial" w:hAnsi="Arial"/>
       <w:b/>
       <w:bCs/>
       <w:color w:val="376092" w:themeColor="accent1" w:themeShade="BF"/>
@@ -7291,7 +7515,7 @@
     <w:qFormat/>
     <w:uiPriority w:val="9"/>
     <w:rPr>
-      <w:rFonts w:asciiTheme="majorHAnsi" w:hAnsiTheme="majorHAnsi" w:eastAsiaTheme="majorEastAsia" w:cstheme="majorBidi"/>
+      <w:rFonts w:asciiTheme="majorHAnsi" w:hAnsiTheme="majorHAnsi" w:eastAsiaTheme="majorEastAsia" w:cstheme="majorBidi" w:ascii="Arial" w:hAnsi="Arial"/>
       <w:b/>
       <w:bCs/>
       <w:color w:val="4F81BD" w:themeColor="accent1"/>
@@ -7311,7 +7535,7 @@
     <w:qFormat/>
     <w:uiPriority w:val="9"/>
     <w:rPr>
-      <w:rFonts w:asciiTheme="majorHAnsi" w:hAnsiTheme="majorHAnsi" w:eastAsiaTheme="majorEastAsia" w:cstheme="majorBidi"/>
+      <w:rFonts w:asciiTheme="majorHAnsi" w:hAnsiTheme="majorHAnsi" w:eastAsiaTheme="majorEastAsia" w:cstheme="majorBidi" w:ascii="Arial" w:hAnsi="Arial"/>
       <w:b/>
       <w:bCs/>
       <w:color w:val="4F81BD" w:themeColor="accent1"/>
@@ -7329,7 +7553,7 @@
     <w:qFormat/>
     <w:uiPriority w:val="10"/>
     <w:rPr>
-      <w:rFonts w:asciiTheme="majorHAnsi" w:hAnsiTheme="majorHAnsi" w:eastAsiaTheme="majorEastAsia" w:cstheme="majorBidi"/>
+      <w:rFonts w:asciiTheme="majorHAnsi" w:hAnsiTheme="majorHAnsi" w:eastAsiaTheme="majorEastAsia" w:cstheme="majorBidi" w:ascii="Arial" w:hAnsi="Arial"/>
       <w:color w:val="17375E" w:themeColor="text2" w:themeShade="BF"/>
       <w:spacing w:val="5"/>
       <w:kern w:val="28"/>
@@ -7344,7 +7568,7 @@
     <w:qFormat/>
     <w:uiPriority w:val="11"/>
     <w:rPr>
-      <w:rFonts w:asciiTheme="majorHAnsi" w:hAnsiTheme="majorHAnsi" w:eastAsiaTheme="majorEastAsia" w:cstheme="majorBidi"/>
+      <w:rFonts w:asciiTheme="majorHAnsi" w:hAnsiTheme="majorHAnsi" w:eastAsiaTheme="majorEastAsia" w:cstheme="majorBidi" w:ascii="Arial" w:hAnsi="Arial"/>
       <w:i/>
       <w:iCs/>
       <w:color w:val="4F81BD" w:themeColor="accent1"/>
@@ -7367,18 +7591,27 @@
       <w:ind w:left="720"/>
       <w:contextualSpacing/>
     </w:pPr>
+    <w:rPr>
+      <w:rFonts w:ascii="Arial" w:hAnsi="Arial"/>
+    </w:rPr>
   </w:style>
   <w:style w:type="character" w:customStyle="1" w:styleId="46">
     <w:name w:val="Body Text Char"/>
     <w:basedOn w:val="11"/>
     <w:link w:val="20"/>
     <w:uiPriority w:val="99"/>
+    <w:rPr>
+      <w:rFonts w:ascii="Arial" w:hAnsi="Arial"/>
+    </w:rPr>
   </w:style>
   <w:style w:type="character" w:customStyle="1" w:styleId="47">
     <w:name w:val="Body Text 2 Char"/>
     <w:basedOn w:val="11"/>
     <w:link w:val="16"/>
     <w:uiPriority w:val="99"/>
+    <w:rPr>
+      <w:rFonts w:ascii="Arial" w:hAnsi="Arial"/>
+    </w:rPr>
   </w:style>
   <w:style w:type="character" w:customStyle="1" w:styleId="48">
     <w:name w:val="Body Text 3 Char"/>
@@ -7387,6 +7620,7 @@
     <w:qFormat/>
     <w:uiPriority w:val="99"/>
     <w:rPr>
+      <w:rFonts w:ascii="Arial" w:hAnsi="Arial"/>
       <w:sz w:val="16"/>
       <w:szCs w:val="16"/>
     </w:rPr>
@@ -7397,7 +7631,7 @@
     <w:link w:val="21"/>
     <w:uiPriority w:val="99"/>
     <w:rPr>
-      <w:rFonts w:ascii="Courier" w:hAnsi="Courier"/>
+      <w:rFonts w:ascii="Arial" w:hAnsi="Arial"/>
       <w:sz w:val="20"/>
       <w:szCs w:val="20"/>
     </w:rPr>
@@ -7410,6 +7644,7 @@
     <w:qFormat/>
     <w:uiPriority w:val="29"/>
     <w:rPr>
+      <w:rFonts w:ascii="Arial" w:hAnsi="Arial"/>
       <w:i/>
       <w:iCs/>
       <w:color w:val="000000" w:themeColor="text1"/>
@@ -7426,6 +7661,7 @@
     <w:link w:val="50"/>
     <w:uiPriority w:val="29"/>
     <w:rPr>
+      <w:rFonts w:ascii="Arial" w:hAnsi="Arial"/>
       <w:i/>
       <w:iCs/>
       <w:color w:val="000000" w:themeColor="text1"/>
@@ -7443,7 +7679,7 @@
     <w:semiHidden/>
     <w:uiPriority w:val="9"/>
     <w:rPr>
-      <w:rFonts w:asciiTheme="majorHAnsi" w:hAnsiTheme="majorHAnsi" w:eastAsiaTheme="majorEastAsia" w:cstheme="majorBidi"/>
+      <w:rFonts w:asciiTheme="majorHAnsi" w:hAnsiTheme="majorHAnsi" w:eastAsiaTheme="majorEastAsia" w:cstheme="majorBidi" w:ascii="Arial" w:hAnsi="Arial"/>
       <w:b/>
       <w:bCs/>
       <w:i/>
@@ -7463,7 +7699,7 @@
     <w:semiHidden/>
     <w:uiPriority w:val="9"/>
     <w:rPr>
-      <w:rFonts w:asciiTheme="majorHAnsi" w:hAnsiTheme="majorHAnsi" w:eastAsiaTheme="majorEastAsia" w:cstheme="majorBidi"/>
+      <w:rFonts w:asciiTheme="majorHAnsi" w:hAnsiTheme="majorHAnsi" w:eastAsiaTheme="majorEastAsia" w:cstheme="majorBidi" w:ascii="Arial" w:hAnsi="Arial"/>
       <w:color w:val="254061" w:themeColor="accent1" w:themeShade="80"/>
     </w:rPr>
   </w:style>
@@ -7475,7 +7711,7 @@
     <w:qFormat/>
     <w:uiPriority w:val="9"/>
     <w:rPr>
-      <w:rFonts w:asciiTheme="majorHAnsi" w:hAnsiTheme="majorHAnsi" w:eastAsiaTheme="majorEastAsia" w:cstheme="majorBidi"/>
+      <w:rFonts w:asciiTheme="majorHAnsi" w:hAnsiTheme="majorHAnsi" w:eastAsiaTheme="majorEastAsia" w:cstheme="majorBidi" w:ascii="Arial" w:hAnsi="Arial"/>
       <w:i/>
       <w:iCs/>
       <w:color w:val="254061" w:themeColor="accent1" w:themeShade="80"/>
@@ -7488,7 +7724,7 @@
     <w:semiHidden/>
     <w:uiPriority w:val="9"/>
     <w:rPr>
-      <w:rFonts w:asciiTheme="majorHAnsi" w:hAnsiTheme="majorHAnsi" w:eastAsiaTheme="majorEastAsia" w:cstheme="majorBidi"/>
+      <w:rFonts w:asciiTheme="majorHAnsi" w:hAnsiTheme="majorHAnsi" w:eastAsiaTheme="majorEastAsia" w:cstheme="majorBidi" w:ascii="Arial" w:hAnsi="Arial"/>
       <w:i/>
       <w:iCs/>
       <w:color w:val="404040" w:themeColor="text1" w:themeTint="BF"/>
@@ -7509,7 +7745,7 @@
     <w:semiHidden/>
     <w:uiPriority w:val="9"/>
     <w:rPr>
-      <w:rFonts w:asciiTheme="majorHAnsi" w:hAnsiTheme="majorHAnsi" w:eastAsiaTheme="majorEastAsia" w:cstheme="majorBidi"/>
+      <w:rFonts w:asciiTheme="majorHAnsi" w:hAnsiTheme="majorHAnsi" w:eastAsiaTheme="majorEastAsia" w:cstheme="majorBidi" w:ascii="Arial" w:hAnsi="Arial"/>
       <w:color w:val="4F81BD" w:themeColor="accent1"/>
       <w:sz w:val="20"/>
       <w:szCs w:val="20"/>
@@ -7528,7 +7764,7 @@
     <w:qFormat/>
     <w:uiPriority w:val="9"/>
     <w:rPr>
-      <w:rFonts w:asciiTheme="majorHAnsi" w:hAnsiTheme="majorHAnsi" w:eastAsiaTheme="majorEastAsia" w:cstheme="majorBidi"/>
+      <w:rFonts w:asciiTheme="majorHAnsi" w:hAnsiTheme="majorHAnsi" w:eastAsiaTheme="majorEastAsia" w:cstheme="majorBidi" w:ascii="Arial" w:hAnsi="Arial"/>
       <w:i/>
       <w:iCs/>
       <w:color w:val="404040" w:themeColor="text1" w:themeTint="BF"/>
@@ -7559,6 +7795,7 @@
       <w:ind w:left="936" w:right="936"/>
     </w:pPr>
     <w:rPr>
+      <w:rFonts w:ascii="Arial" w:hAnsi="Arial"/>
       <w:b/>
       <w:bCs/>
       <w:i/>
@@ -7578,6 +7815,7 @@
     <w:qFormat/>
     <w:uiPriority w:val="30"/>
     <w:rPr>
+      <w:rFonts w:ascii="Arial" w:hAnsi="Arial"/>
       <w:b/>
       <w:bCs/>
       <w:i/>
@@ -7596,6 +7834,7 @@
     <w:qFormat/>
     <w:uiPriority w:val="19"/>
     <w:rPr>
+      <w:rFonts w:ascii="Arial" w:hAnsi="Arial"/>
       <w:i/>
       <w:iCs/>
       <w:color w:val="808080" w:themeColor="text1" w:themeTint="80"/>
@@ -7615,6 +7854,7 @@
     <w:qFormat/>
     <w:uiPriority w:val="21"/>
     <w:rPr>
+      <w:rFonts w:ascii="Arial" w:hAnsi="Arial"/>
       <w:b/>
       <w:bCs/>
       <w:i/>
@@ -7633,6 +7873,7 @@
     <w:qFormat/>
     <w:uiPriority w:val="31"/>
     <w:rPr>
+      <w:rFonts w:ascii="Arial" w:hAnsi="Arial"/>
       <w:smallCaps/>
       <w:color w:val="C0504D" w:themeColor="accent2"/>
       <w:u w:val="single"/>
@@ -7649,6 +7890,7 @@
     <w:qFormat/>
     <w:uiPriority w:val="32"/>
     <w:rPr>
+      <w:rFonts w:ascii="Arial" w:hAnsi="Arial"/>
       <w:b/>
       <w:bCs/>
       <w:smallCaps/>
@@ -7668,6 +7910,7 @@
     <w:qFormat/>
     <w:uiPriority w:val="33"/>
     <w:rPr>
+      <w:rFonts w:ascii="Arial" w:hAnsi="Arial"/>
       <w:b/>
       <w:bCs/>
       <w:smallCaps/>
@@ -7685,6 +7928,9 @@
     <w:pPr>
       <w:outlineLvl w:val="9"/>
     </w:pPr>
+    <w:rPr>
+      <w:rFonts w:ascii="Arial" w:hAnsi="Arial"/>
+    </w:rPr>
   </w:style>
   <w:style w:type="table" w:styleId="66">
     <w:name w:val="Light Shading"/>
@@ -7694,6 +7940,7 @@
       <w:spacing w:after="0" w:line="240" w:lineRule="auto"/>
     </w:pPr>
     <w:rPr>
+      <w:rFonts w:ascii="Arial" w:hAnsi="Arial"/>
       <w:color w:val="000000" w:themeColor="text1" w:themeShade="BF"/>
     </w:rPr>
     <w:tblPr>
@@ -7789,6 +8036,7 @@
       <w:spacing w:after="0" w:line="240" w:lineRule="auto"/>
     </w:pPr>
     <w:rPr>
+      <w:rFonts w:ascii="Arial" w:hAnsi="Arial"/>
       <w:color w:val="376092" w:themeColor="accent1" w:themeShade="BF"/>
     </w:rPr>
     <w:tblPr>
@@ -7884,6 +8132,7 @@
       <w:spacing w:after="0" w:line="240" w:lineRule="auto"/>
     </w:pPr>
     <w:rPr>
+      <w:rFonts w:ascii="Arial" w:hAnsi="Arial"/>
       <w:color w:val="953735" w:themeColor="accent2" w:themeShade="BF"/>
     </w:rPr>
     <w:tblPr>
@@ -7979,6 +8228,7 @@
       <w:spacing w:after="0" w:line="240" w:lineRule="auto"/>
     </w:pPr>
     <w:rPr>
+      <w:rFonts w:ascii="Arial" w:hAnsi="Arial"/>
       <w:color w:val="77933C" w:themeColor="accent3" w:themeShade="BF"/>
     </w:rPr>
     <w:tblPr>
@@ -8074,6 +8324,7 @@
       <w:spacing w:after="0" w:line="240" w:lineRule="auto"/>
     </w:pPr>
     <w:rPr>
+      <w:rFonts w:ascii="Arial" w:hAnsi="Arial"/>
       <w:color w:val="604A7B" w:themeColor="accent4" w:themeShade="BF"/>
     </w:rPr>
     <w:tblPr>
@@ -8170,6 +8421,7 @@
       <w:spacing w:after="0" w:line="240" w:lineRule="auto"/>
     </w:pPr>
     <w:rPr>
+      <w:rFonts w:ascii="Arial" w:hAnsi="Arial"/>
       <w:color w:val="31859C" w:themeColor="accent5" w:themeShade="BF"/>
     </w:rPr>
     <w:tblPr>
@@ -8265,6 +8517,7 @@
       <w:spacing w:after="0" w:line="240" w:lineRule="auto"/>
     </w:pPr>
     <w:rPr>
+      <w:rFonts w:ascii="Arial" w:hAnsi="Arial"/>
       <w:color w:val="E46C0A" w:themeColor="accent6" w:themeShade="BF"/>
     </w:rPr>
     <w:tblPr>
@@ -8360,6 +8613,9 @@
     <w:pPr>
       <w:spacing w:after="0" w:line="240" w:lineRule="auto"/>
     </w:pPr>
+    <w:rPr>
+      <w:rFonts w:ascii="Arial" w:hAnsi="Arial"/>
+    </w:rPr>
     <w:tblPr>
       <w:tblBorders>
         <w:top w:val="single" w:color="000000" w:themeColor="text1" w:sz="8" w:space="0"/>
@@ -8449,6 +8705,9 @@
     <w:pPr>
       <w:spacing w:after="0" w:line="240" w:lineRule="auto"/>
     </w:pPr>
+    <w:rPr>
+      <w:rFonts w:ascii="Arial" w:hAnsi="Arial"/>
+    </w:rPr>
     <w:tblPr>
       <w:tblBorders>
         <w:top w:val="single" w:color="4F81BD" w:themeColor="accent1" w:sz="8" w:space="0"/>
@@ -8538,6 +8797,9 @@
     <w:pPr>
       <w:spacing w:after="0" w:line="240" w:lineRule="auto"/>
     </w:pPr>
+    <w:rPr>
+      <w:rFonts w:ascii="Arial" w:hAnsi="Arial"/>
+    </w:rPr>
     <w:tblPr>
       <w:tblBorders>
         <w:top w:val="single" w:color="C0504D" w:themeColor="accent2" w:sz="8" w:space="0"/>
@@ -8628,6 +8890,9 @@
     <w:pPr>
       <w:spacing w:after="0" w:line="240" w:lineRule="auto"/>
     </w:pPr>
+    <w:rPr>
+      <w:rFonts w:ascii="Arial" w:hAnsi="Arial"/>
+    </w:rPr>
     <w:tblPr>
       <w:tblBorders>
         <w:top w:val="single" w:color="9BBB59" w:themeColor="accent3" w:sz="8" w:space="0"/>
@@ -8717,6 +8982,9 @@
     <w:pPr>
       <w:spacing w:after="0" w:line="240" w:lineRule="auto"/>
     </w:pPr>
+    <w:rPr>
+      <w:rFonts w:ascii="Arial" w:hAnsi="Arial"/>
+    </w:rPr>
     <w:tblPr>
       <w:tblBorders>
         <w:top w:val="single" w:color="8064A2" w:themeColor="accent4" w:sz="8" w:space="0"/>
@@ -8806,6 +9074,9 @@
     <w:pPr>
       <w:spacing w:after="0" w:line="240" w:lineRule="auto"/>
     </w:pPr>
+    <w:rPr>
+      <w:rFonts w:ascii="Arial" w:hAnsi="Arial"/>
+    </w:rPr>
     <w:tblPr>
       <w:tblBorders>
         <w:top w:val="single" w:color="4BACC6" w:themeColor="accent5" w:sz="8" w:space="0"/>
@@ -8896,6 +9167,9 @@
     <w:pPr>
       <w:spacing w:after="0" w:line="240" w:lineRule="auto"/>
     </w:pPr>
+    <w:rPr>
+      <w:rFonts w:ascii="Arial" w:hAnsi="Arial"/>
+    </w:rPr>
     <w:tblPr>
       <w:tblBorders>
         <w:top w:val="single" w:color="F79646" w:themeColor="accent6" w:sz="8" w:space="0"/>
@@ -8985,6 +9259,9 @@
     <w:pPr>
       <w:spacing w:after="0" w:line="240" w:lineRule="auto"/>
     </w:pPr>
+    <w:rPr>
+      <w:rFonts w:ascii="Arial" w:hAnsi="Arial"/>
+    </w:rPr>
     <w:tblPr>
       <w:tblBorders>
         <w:top w:val="single" w:color="000000" w:themeColor="text1" w:sz="8" w:space="0"/>
@@ -9105,6 +9382,9 @@
     <w:pPr>
       <w:spacing w:after="0" w:line="240" w:lineRule="auto"/>
     </w:pPr>
+    <w:rPr>
+      <w:rFonts w:ascii="Arial" w:hAnsi="Arial"/>
+    </w:rPr>
     <w:tblPr>
       <w:tblBorders>
         <w:top w:val="single" w:color="4F81BD" w:themeColor="accent1" w:sz="8" w:space="0"/>
@@ -9225,6 +9505,9 @@
     <w:pPr>
       <w:spacing w:after="0" w:line="240" w:lineRule="auto"/>
     </w:pPr>
+    <w:rPr>
+      <w:rFonts w:ascii="Arial" w:hAnsi="Arial"/>
+    </w:rPr>
     <w:tblPr>
       <w:tblBorders>
         <w:top w:val="single" w:color="C0504D" w:themeColor="accent2" w:sz="8" w:space="0"/>
@@ -9346,6 +9629,9 @@
     <w:pPr>
       <w:spacing w:after="0" w:line="240" w:lineRule="auto"/>
     </w:pPr>
+    <w:rPr>
+      <w:rFonts w:ascii="Arial" w:hAnsi="Arial"/>
+    </w:rPr>
     <w:tblPr>
       <w:tblBorders>
         <w:top w:val="single" w:color="9BBB59" w:themeColor="accent3" w:sz="8" w:space="0"/>
@@ -9466,6 +9752,9 @@
     <w:pPr>
       <w:spacing w:after="0" w:line="240" w:lineRule="auto"/>
     </w:pPr>
+    <w:rPr>
+      <w:rFonts w:ascii="Arial" w:hAnsi="Arial"/>
+    </w:rPr>
     <w:tblPr>
       <w:tblBorders>
         <w:top w:val="single" w:color="8064A2" w:themeColor="accent4" w:sz="8" w:space="0"/>
@@ -9587,6 +9876,9 @@
     <w:pPr>
       <w:spacing w:after="0" w:line="240" w:lineRule="auto"/>
     </w:pPr>
+    <w:rPr>
+      <w:rFonts w:ascii="Arial" w:hAnsi="Arial"/>
+    </w:rPr>
     <w:tblPr>
       <w:tblBorders>
         <w:top w:val="single" w:color="4BACC6" w:themeColor="accent5" w:sz="8" w:space="0"/>
@@ -9707,6 +9999,9 @@
     <w:pPr>
       <w:spacing w:after="0" w:line="240" w:lineRule="auto"/>
     </w:pPr>
+    <w:rPr>
+      <w:rFonts w:ascii="Arial" w:hAnsi="Arial"/>
+    </w:rPr>
     <w:tblPr>
       <w:tblBorders>
         <w:top w:val="single" w:color="F79646" w:themeColor="accent6" w:sz="8" w:space="0"/>
@@ -9828,6 +10123,9 @@
     <w:pPr>
       <w:spacing w:after="0" w:line="240" w:lineRule="auto"/>
     </w:pPr>
+    <w:rPr>
+      <w:rFonts w:ascii="Arial" w:hAnsi="Arial"/>
+    </w:rPr>
     <w:tblPr>
       <w:tblBorders>
         <w:top w:val="single" w:color="3F3F3F" w:themeColor="text1" w:themeTint="BF" w:sz="8" w:space="0"/>
@@ -9930,6 +10228,9 @@
     <w:pPr>
       <w:spacing w:after="0" w:line="240" w:lineRule="auto"/>
     </w:pPr>
+    <w:rPr>
+      <w:rFonts w:ascii="Arial" w:hAnsi="Arial"/>
+    </w:rPr>
     <w:tblPr>
       <w:tblBorders>
         <w:top w:val="single" w:color="7BA0CD" w:themeColor="accent1" w:themeTint="BF" w:sz="8" w:space="0"/>
@@ -10033,6 +10334,9 @@
     <w:pPr>
       <w:spacing w:after="0" w:line="240" w:lineRule="auto"/>
     </w:pPr>
+    <w:rPr>
+      <w:rFonts w:ascii="Arial" w:hAnsi="Arial"/>
+    </w:rPr>
     <w:tblPr>
       <w:tblBorders>
         <w:top w:val="single" w:color="CF7B79" w:themeColor="accent2" w:themeTint="BF" w:sz="8" w:space="0"/>
@@ -10135,6 +10439,9 @@
     <w:pPr>
       <w:spacing w:after="0" w:line="240" w:lineRule="auto"/>
     </w:pPr>
+    <w:rPr>
+      <w:rFonts w:ascii="Arial" w:hAnsi="Arial"/>
+    </w:rPr>
     <w:tblPr>
       <w:tblBorders>
         <w:top w:val="single" w:color="B4CC82" w:themeColor="accent3" w:themeTint="BF" w:sz="8" w:space="0"/>
@@ -10237,6 +10544,9 @@
     <w:pPr>
       <w:spacing w:after="0" w:line="240" w:lineRule="auto"/>
     </w:pPr>
+    <w:rPr>
+      <w:rFonts w:ascii="Arial" w:hAnsi="Arial"/>
+    </w:rPr>
     <w:tblPr>
       <w:tblBorders>
         <w:top w:val="single" w:color="9F8AB9" w:themeColor="accent4" w:themeTint="BF" w:sz="8" w:space="0"/>
@@ -10339,6 +10649,9 @@
     <w:pPr>
       <w:spacing w:after="0" w:line="240" w:lineRule="auto"/>
     </w:pPr>
+    <w:rPr>
+      <w:rFonts w:ascii="Arial" w:hAnsi="Arial"/>
+    </w:rPr>
     <w:tblPr>
       <w:tblBorders>
         <w:top w:val="single" w:color="78C0D4" w:themeColor="accent5" w:themeTint="BF" w:sz="8" w:space="0"/>
@@ -10441,6 +10754,9 @@
     <w:pPr>
       <w:spacing w:after="0" w:line="240" w:lineRule="auto"/>
     </w:pPr>
+    <w:rPr>
+      <w:rFonts w:ascii="Arial" w:hAnsi="Arial"/>
+    </w:rPr>
     <w:tblPr>
       <w:tblBorders>
         <w:top w:val="single" w:color="F9B074" w:themeColor="accent6" w:themeTint="BF" w:sz="8" w:space="0"/>
@@ -10543,6 +10859,9 @@
     <w:pPr>
       <w:spacing w:after="0" w:line="240" w:lineRule="auto"/>
     </w:pPr>
+    <w:rPr>
+      <w:rFonts w:ascii="Arial" w:hAnsi="Arial"/>
+    </w:rPr>
     <w:tblPr>
       <w:tblBorders>
         <w:top w:val="single" w:color="auto" w:sz="18" w:space="0"/>
@@ -10700,6 +11019,9 @@
     <w:pPr>
       <w:spacing w:after="0" w:line="240" w:lineRule="auto"/>
     </w:pPr>
+    <w:rPr>
+      <w:rFonts w:ascii="Arial" w:hAnsi="Arial"/>
+    </w:rPr>
     <w:tblPr>
       <w:tblBorders>
         <w:top w:val="single" w:color="auto" w:sz="18" w:space="0"/>
@@ -10857,6 +11179,9 @@
     <w:pPr>
       <w:spacing w:after="0" w:line="240" w:lineRule="auto"/>
     </w:pPr>
+    <w:rPr>
+      <w:rFonts w:ascii="Arial" w:hAnsi="Arial"/>
+    </w:rPr>
     <w:tblPr>
       <w:tblBorders>
         <w:top w:val="single" w:color="auto" w:sz="18" w:space="0"/>
@@ -11014,6 +11339,9 @@
     <w:pPr>
       <w:spacing w:after="0" w:line="240" w:lineRule="auto"/>
     </w:pPr>
+    <w:rPr>
+      <w:rFonts w:ascii="Arial" w:hAnsi="Arial"/>
+    </w:rPr>
     <w:tblPr>
       <w:tblBorders>
         <w:top w:val="single" w:color="auto" w:sz="18" w:space="0"/>
@@ -11171,6 +11499,9 @@
     <w:pPr>
       <w:spacing w:after="0" w:line="240" w:lineRule="auto"/>
     </w:pPr>
+    <w:rPr>
+      <w:rFonts w:ascii="Arial" w:hAnsi="Arial"/>
+    </w:rPr>
     <w:tblPr>
       <w:tblBorders>
         <w:top w:val="single" w:color="auto" w:sz="18" w:space="0"/>
@@ -11329,6 +11660,9 @@
     <w:pPr>
       <w:spacing w:after="0" w:line="240" w:lineRule="auto"/>
     </w:pPr>
+    <w:rPr>
+      <w:rFonts w:ascii="Arial" w:hAnsi="Arial"/>
+    </w:rPr>
     <w:tblPr>
       <w:tblBorders>
         <w:top w:val="single" w:color="auto" w:sz="18" w:space="0"/>
@@ -11486,6 +11820,9 @@
     <w:pPr>
       <w:spacing w:after="0" w:line="240" w:lineRule="auto"/>
     </w:pPr>
+    <w:rPr>
+      <w:rFonts w:ascii="Arial" w:hAnsi="Arial"/>
+    </w:rPr>
     <w:tblPr>
       <w:tblBorders>
         <w:top w:val="single" w:color="auto" w:sz="18" w:space="0"/>
@@ -11644,6 +11981,7 @@
       <w:spacing w:after="0" w:line="240" w:lineRule="auto"/>
     </w:pPr>
     <w:rPr>
+      <w:rFonts w:ascii="Arial" w:hAnsi="Arial"/>
       <w:color w:val="000000" w:themeColor="text1"/>
       <w14:textFill>
         <w14:solidFill>
@@ -11729,6 +12067,7 @@
       <w:spacing w:after="0" w:line="240" w:lineRule="auto"/>
     </w:pPr>
     <w:rPr>
+      <w:rFonts w:ascii="Arial" w:hAnsi="Arial"/>
       <w:color w:val="000000" w:themeColor="text1"/>
       <w14:textFill>
         <w14:solidFill>
@@ -11814,6 +12153,7 @@
       <w:spacing w:after="0" w:line="240" w:lineRule="auto"/>
     </w:pPr>
     <w:rPr>
+      <w:rFonts w:ascii="Arial" w:hAnsi="Arial"/>
       <w:color w:val="000000" w:themeColor="text1"/>
       <w14:textFill>
         <w14:solidFill>
@@ -11899,6 +12239,7 @@
       <w:spacing w:after="0" w:line="240" w:lineRule="auto"/>
     </w:pPr>
     <w:rPr>
+      <w:rFonts w:ascii="Arial" w:hAnsi="Arial"/>
       <w:color w:val="000000" w:themeColor="text1"/>
       <w14:textFill>
         <w14:solidFill>
@@ -11984,6 +12325,7 @@
       <w:spacing w:after="0" w:line="240" w:lineRule="auto"/>
     </w:pPr>
     <w:rPr>
+      <w:rFonts w:ascii="Arial" w:hAnsi="Arial"/>
       <w:color w:val="000000" w:themeColor="text1"/>
       <w14:textFill>
         <w14:solidFill>
@@ -12069,6 +12411,7 @@
       <w:spacing w:after="0" w:line="240" w:lineRule="auto"/>
     </w:pPr>
     <w:rPr>
+      <w:rFonts w:ascii="Arial" w:hAnsi="Arial"/>
       <w:color w:val="000000" w:themeColor="text1"/>
       <w14:textFill>
         <w14:solidFill>
@@ -12154,6 +12497,7 @@
       <w:spacing w:after="0" w:line="240" w:lineRule="auto"/>
     </w:pPr>
     <w:rPr>
+      <w:rFonts w:ascii="Arial" w:hAnsi="Arial"/>
       <w:color w:val="000000" w:themeColor="text1"/>
       <w14:textFill>
         <w14:solidFill>
@@ -12240,7 +12584,7 @@
       <w:spacing w:after="0" w:line="240" w:lineRule="auto"/>
     </w:pPr>
     <w:rPr>
-      <w:rFonts w:asciiTheme="majorHAnsi" w:hAnsiTheme="majorHAnsi" w:eastAsiaTheme="majorEastAsia" w:cstheme="majorBidi"/>
+      <w:rFonts w:asciiTheme="majorHAnsi" w:hAnsiTheme="majorHAnsi" w:eastAsiaTheme="majorEastAsia" w:cstheme="majorBidi" w:ascii="Arial" w:hAnsi="Arial"/>
       <w:color w:val="000000" w:themeColor="text1"/>
       <w14:textFill>
         <w14:solidFill>
@@ -12361,7 +12705,7 @@
       <w:spacing w:after="0" w:line="240" w:lineRule="auto"/>
     </w:pPr>
     <w:rPr>
-      <w:rFonts w:asciiTheme="majorHAnsi" w:hAnsiTheme="majorHAnsi" w:eastAsiaTheme="majorEastAsia" w:cstheme="majorBidi"/>
+      <w:rFonts w:asciiTheme="majorHAnsi" w:hAnsiTheme="majorHAnsi" w:eastAsiaTheme="majorEastAsia" w:cstheme="majorBidi" w:ascii="Arial" w:hAnsi="Arial"/>
       <w:color w:val="000000" w:themeColor="text1"/>
       <w14:textFill>
         <w14:solidFill>
@@ -12482,7 +12826,7 @@
       <w:spacing w:after="0" w:line="240" w:lineRule="auto"/>
     </w:pPr>
     <w:rPr>
-      <w:rFonts w:asciiTheme="majorHAnsi" w:hAnsiTheme="majorHAnsi" w:eastAsiaTheme="majorEastAsia" w:cstheme="majorBidi"/>
+      <w:rFonts w:asciiTheme="majorHAnsi" w:hAnsiTheme="majorHAnsi" w:eastAsiaTheme="majorEastAsia" w:cstheme="majorBidi" w:ascii="Arial" w:hAnsi="Arial"/>
       <w:color w:val="000000" w:themeColor="text1"/>
       <w14:textFill>
         <w14:solidFill>
@@ -12603,7 +12947,7 @@
       <w:spacing w:after="0" w:line="240" w:lineRule="auto"/>
     </w:pPr>
     <w:rPr>
-      <w:rFonts w:asciiTheme="majorHAnsi" w:hAnsiTheme="majorHAnsi" w:eastAsiaTheme="majorEastAsia" w:cstheme="majorBidi"/>
+      <w:rFonts w:asciiTheme="majorHAnsi" w:hAnsiTheme="majorHAnsi" w:eastAsiaTheme="majorEastAsia" w:cstheme="majorBidi" w:ascii="Arial" w:hAnsi="Arial"/>
       <w:color w:val="000000" w:themeColor="text1"/>
       <w14:textFill>
         <w14:solidFill>
@@ -12724,7 +13068,7 @@
       <w:spacing w:after="0" w:line="240" w:lineRule="auto"/>
     </w:pPr>
     <w:rPr>
-      <w:rFonts w:asciiTheme="majorHAnsi" w:hAnsiTheme="majorHAnsi" w:eastAsiaTheme="majorEastAsia" w:cstheme="majorBidi"/>
+      <w:rFonts w:asciiTheme="majorHAnsi" w:hAnsiTheme="majorHAnsi" w:eastAsiaTheme="majorEastAsia" w:cstheme="majorBidi" w:ascii="Arial" w:hAnsi="Arial"/>
       <w:color w:val="000000" w:themeColor="text1"/>
       <w14:textFill>
         <w14:solidFill>
@@ -12845,7 +13189,7 @@
       <w:spacing w:after="0" w:line="240" w:lineRule="auto"/>
     </w:pPr>
     <w:rPr>
-      <w:rFonts w:asciiTheme="majorHAnsi" w:hAnsiTheme="majorHAnsi" w:eastAsiaTheme="majorEastAsia" w:cstheme="majorBidi"/>
+      <w:rFonts w:asciiTheme="majorHAnsi" w:hAnsiTheme="majorHAnsi" w:eastAsiaTheme="majorEastAsia" w:cstheme="majorBidi" w:ascii="Arial" w:hAnsi="Arial"/>
       <w:color w:val="000000" w:themeColor="text1"/>
       <w14:textFill>
         <w14:solidFill>
@@ -12966,7 +13310,7 @@
       <w:spacing w:after="0" w:line="240" w:lineRule="auto"/>
     </w:pPr>
     <w:rPr>
-      <w:rFonts w:asciiTheme="majorHAnsi" w:hAnsiTheme="majorHAnsi" w:eastAsiaTheme="majorEastAsia" w:cstheme="majorBidi"/>
+      <w:rFonts w:asciiTheme="majorHAnsi" w:hAnsiTheme="majorHAnsi" w:eastAsiaTheme="majorEastAsia" w:cstheme="majorBidi" w:ascii="Arial" w:hAnsi="Arial"/>
       <w:color w:val="000000" w:themeColor="text1"/>
       <w14:textFill>
         <w14:solidFill>
@@ -13086,6 +13430,9 @@
     <w:pPr>
       <w:spacing w:after="0" w:line="240" w:lineRule="auto"/>
     </w:pPr>
+    <w:rPr>
+      <w:rFonts w:ascii="Arial" w:hAnsi="Arial"/>
+    </w:rPr>
     <w:tblPr>
       <w:tblBorders>
         <w:top w:val="single" w:color="3F3F3F" w:themeColor="text1" w:themeTint="BF" w:sz="8" w:space="0"/>
@@ -13152,6 +13499,9 @@
     <w:pPr>
       <w:spacing w:after="0" w:line="240" w:lineRule="auto"/>
     </w:pPr>
+    <w:rPr>
+      <w:rFonts w:ascii="Arial" w:hAnsi="Arial"/>
+    </w:rPr>
     <w:tblPr>
       <w:tblBorders>
         <w:top w:val="single" w:color="7BA0CD" w:themeColor="accent1" w:themeTint="BF" w:sz="8" w:space="0"/>
@@ -13218,6 +13568,9 @@
     <w:pPr>
       <w:spacing w:after="0" w:line="240" w:lineRule="auto"/>
     </w:pPr>
+    <w:rPr>
+      <w:rFonts w:ascii="Arial" w:hAnsi="Arial"/>
+    </w:rPr>
     <w:tblPr>
       <w:tblBorders>
         <w:top w:val="single" w:color="CF7B79" w:themeColor="accent2" w:themeTint="BF" w:sz="8" w:space="0"/>
@@ -13284,6 +13637,9 @@
     <w:pPr>
       <w:spacing w:after="0" w:line="240" w:lineRule="auto"/>
     </w:pPr>
+    <w:rPr>
+      <w:rFonts w:ascii="Arial" w:hAnsi="Arial"/>
+    </w:rPr>
     <w:tblPr>
       <w:tblBorders>
         <w:top w:val="single" w:color="B4CC82" w:themeColor="accent3" w:themeTint="BF" w:sz="8" w:space="0"/>
@@ -13350,6 +13706,9 @@
     <w:pPr>
       <w:spacing w:after="0" w:line="240" w:lineRule="auto"/>
     </w:pPr>
+    <w:rPr>
+      <w:rFonts w:ascii="Arial" w:hAnsi="Arial"/>
+    </w:rPr>
     <w:tblPr>
       <w:tblBorders>
         <w:top w:val="single" w:color="9F8AB9" w:themeColor="accent4" w:themeTint="BF" w:sz="8" w:space="0"/>
@@ -13416,6 +13775,9 @@
     <w:pPr>
       <w:spacing w:after="0" w:line="240" w:lineRule="auto"/>
     </w:pPr>
+    <w:rPr>
+      <w:rFonts w:ascii="Arial" w:hAnsi="Arial"/>
+    </w:rPr>
     <w:tblPr>
       <w:tblBorders>
         <w:top w:val="single" w:color="78C0D4" w:themeColor="accent5" w:themeTint="BF" w:sz="8" w:space="0"/>
@@ -13482,6 +13844,9 @@
     <w:pPr>
       <w:spacing w:after="0" w:line="240" w:lineRule="auto"/>
     </w:pPr>
+    <w:rPr>
+      <w:rFonts w:ascii="Arial" w:hAnsi="Arial"/>
+    </w:rPr>
     <w:tblPr>
       <w:tblBorders>
         <w:top w:val="single" w:color="F9B074" w:themeColor="accent6" w:themeTint="BF" w:sz="8" w:space="0"/>
@@ -13549,7 +13914,7 @@
       <w:spacing w:after="0" w:line="240" w:lineRule="auto"/>
     </w:pPr>
     <w:rPr>
-      <w:rFonts w:asciiTheme="majorHAnsi" w:hAnsiTheme="majorHAnsi" w:eastAsiaTheme="majorEastAsia" w:cstheme="majorBidi"/>
+      <w:rFonts w:asciiTheme="majorHAnsi" w:hAnsiTheme="majorHAnsi" w:eastAsiaTheme="majorEastAsia" w:cstheme="majorBidi" w:ascii="Arial" w:hAnsi="Arial"/>
       <w:color w:val="000000" w:themeColor="text1"/>
       <w14:textFill>
         <w14:solidFill>
@@ -13688,7 +14053,7 @@
       <w:spacing w:after="0" w:line="240" w:lineRule="auto"/>
     </w:pPr>
     <w:rPr>
-      <w:rFonts w:asciiTheme="majorHAnsi" w:hAnsiTheme="majorHAnsi" w:eastAsiaTheme="majorEastAsia" w:cstheme="majorBidi"/>
+      <w:rFonts w:asciiTheme="majorHAnsi" w:hAnsiTheme="majorHAnsi" w:eastAsiaTheme="majorEastAsia" w:cstheme="majorBidi" w:ascii="Arial" w:hAnsi="Arial"/>
       <w:color w:val="000000" w:themeColor="text1"/>
       <w14:textFill>
         <w14:solidFill>
@@ -13828,7 +14193,7 @@
       <w:spacing w:after="0" w:line="240" w:lineRule="auto"/>
     </w:pPr>
     <w:rPr>
-      <w:rFonts w:asciiTheme="majorHAnsi" w:hAnsiTheme="majorHAnsi" w:eastAsiaTheme="majorEastAsia" w:cstheme="majorBidi"/>
+      <w:rFonts w:asciiTheme="majorHAnsi" w:hAnsiTheme="majorHAnsi" w:eastAsiaTheme="majorEastAsia" w:cstheme="majorBidi" w:ascii="Arial" w:hAnsi="Arial"/>
       <w:color w:val="000000" w:themeColor="text1"/>
       <w14:textFill>
         <w14:solidFill>
@@ -13968,7 +14333,7 @@
       <w:spacing w:after="0" w:line="240" w:lineRule="auto"/>
     </w:pPr>
     <w:rPr>
-      <w:rFonts w:asciiTheme="majorHAnsi" w:hAnsiTheme="majorHAnsi" w:eastAsiaTheme="majorEastAsia" w:cstheme="majorBidi"/>
+      <w:rFonts w:asciiTheme="majorHAnsi" w:hAnsiTheme="majorHAnsi" w:eastAsiaTheme="majorEastAsia" w:cstheme="majorBidi" w:ascii="Arial" w:hAnsi="Arial"/>
       <w:color w:val="000000" w:themeColor="text1"/>
       <w14:textFill>
         <w14:solidFill>
@@ -14108,7 +14473,7 @@
       <w:spacing w:after="0" w:line="240" w:lineRule="auto"/>
     </w:pPr>
     <w:rPr>
-      <w:rFonts w:asciiTheme="majorHAnsi" w:hAnsiTheme="majorHAnsi" w:eastAsiaTheme="majorEastAsia" w:cstheme="majorBidi"/>
+      <w:rFonts w:asciiTheme="majorHAnsi" w:hAnsiTheme="majorHAnsi" w:eastAsiaTheme="majorEastAsia" w:cstheme="majorBidi" w:ascii="Arial" w:hAnsi="Arial"/>
       <w:color w:val="000000" w:themeColor="text1"/>
       <w14:textFill>
         <w14:solidFill>
@@ -14247,7 +14612,7 @@
       <w:spacing w:after="0" w:line="240" w:lineRule="auto"/>
     </w:pPr>
     <w:rPr>
-      <w:rFonts w:asciiTheme="majorHAnsi" w:hAnsiTheme="majorHAnsi" w:eastAsiaTheme="majorEastAsia" w:cstheme="majorBidi"/>
+      <w:rFonts w:asciiTheme="majorHAnsi" w:hAnsiTheme="majorHAnsi" w:eastAsiaTheme="majorEastAsia" w:cstheme="majorBidi" w:ascii="Arial" w:hAnsi="Arial"/>
       <w:color w:val="000000" w:themeColor="text1"/>
       <w14:textFill>
         <w14:solidFill>
@@ -14387,7 +14752,7 @@
       <w:spacing w:after="0" w:line="240" w:lineRule="auto"/>
     </w:pPr>
     <w:rPr>
-      <w:rFonts w:asciiTheme="majorHAnsi" w:hAnsiTheme="majorHAnsi" w:eastAsiaTheme="majorEastAsia" w:cstheme="majorBidi"/>
+      <w:rFonts w:asciiTheme="majorHAnsi" w:hAnsiTheme="majorHAnsi" w:eastAsiaTheme="majorEastAsia" w:cstheme="majorBidi" w:ascii="Arial" w:hAnsi="Arial"/>
       <w:color w:val="000000" w:themeColor="text1"/>
       <w14:textFill>
         <w14:solidFill>
@@ -14526,6 +14891,9 @@
     <w:pPr>
       <w:spacing w:after="0" w:line="240" w:lineRule="auto"/>
     </w:pPr>
+    <w:rPr>
+      <w:rFonts w:ascii="Arial" w:hAnsi="Arial"/>
+    </w:rPr>
     <w:tblPr>
       <w:tblBorders>
         <w:top w:val="single" w:color="FFFFFF" w:themeColor="background1" w:sz="8" w:space="0"/>
@@ -14678,6 +15046,9 @@
     <w:pPr>
       <w:spacing w:after="0" w:line="240" w:lineRule="auto"/>
     </w:pPr>
+    <w:rPr>
+      <w:rFonts w:ascii="Arial" w:hAnsi="Arial"/>
+    </w:rPr>
     <w:tblPr>
       <w:tblBorders>
         <w:top w:val="single" w:color="FFFFFF" w:themeColor="background1" w:sz="8" w:space="0"/>
@@ -14830,6 +15201,9 @@
     <w:pPr>
       <w:spacing w:after="0" w:line="240" w:lineRule="auto"/>
     </w:pPr>
+    <w:rPr>
+      <w:rFonts w:ascii="Arial" w:hAnsi="Arial"/>
+    </w:rPr>
     <w:tblPr>
       <w:tblBorders>
         <w:top w:val="single" w:color="FFFFFF" w:themeColor="background1" w:sz="8" w:space="0"/>
@@ -14982,6 +15356,9 @@
     <w:pPr>
       <w:spacing w:after="0" w:line="240" w:lineRule="auto"/>
     </w:pPr>
+    <w:rPr>
+      <w:rFonts w:ascii="Arial" w:hAnsi="Arial"/>
+    </w:rPr>
     <w:tblPr>
       <w:tblBorders>
         <w:top w:val="single" w:color="FFFFFF" w:themeColor="background1" w:sz="8" w:space="0"/>
@@ -15134,6 +15511,9 @@
     <w:pPr>
       <w:spacing w:after="0" w:line="240" w:lineRule="auto"/>
     </w:pPr>
+    <w:rPr>
+      <w:rFonts w:ascii="Arial" w:hAnsi="Arial"/>
+    </w:rPr>
     <w:tblPr>
       <w:tblBorders>
         <w:top w:val="single" w:color="FFFFFF" w:themeColor="background1" w:sz="8" w:space="0"/>
@@ -15286,6 +15666,9 @@
     <w:pPr>
       <w:spacing w:after="0" w:line="240" w:lineRule="auto"/>
     </w:pPr>
+    <w:rPr>
+      <w:rFonts w:ascii="Arial" w:hAnsi="Arial"/>
+    </w:rPr>
     <w:tblPr>
       <w:tblBorders>
         <w:top w:val="single" w:color="FFFFFF" w:themeColor="background1" w:sz="8" w:space="0"/>
@@ -15438,6 +15821,9 @@
     <w:pPr>
       <w:spacing w:after="0" w:line="240" w:lineRule="auto"/>
     </w:pPr>
+    <w:rPr>
+      <w:rFonts w:ascii="Arial" w:hAnsi="Arial"/>
+    </w:rPr>
     <w:tblPr>
       <w:tblBorders>
         <w:top w:val="single" w:color="FFFFFF" w:themeColor="background1" w:sz="8" w:space="0"/>
@@ -15591,6 +15977,7 @@
       <w:spacing w:after="0" w:line="240" w:lineRule="auto"/>
     </w:pPr>
     <w:rPr>
+      <w:rFonts w:ascii="Arial" w:hAnsi="Arial"/>
       <w:color w:val="FFFFFF" w:themeColor="background1"/>
       <w14:textFill>
         <w14:solidFill>
@@ -15701,6 +16088,7 @@
       <w:spacing w:after="0" w:line="240" w:lineRule="auto"/>
     </w:pPr>
     <w:rPr>
+      <w:rFonts w:ascii="Arial" w:hAnsi="Arial"/>
       <w:color w:val="FFFFFF" w:themeColor="background1"/>
       <w14:textFill>
         <w14:solidFill>
@@ -15811,6 +16199,7 @@
       <w:spacing w:after="0" w:line="240" w:lineRule="auto"/>
     </w:pPr>
     <w:rPr>
+      <w:rFonts w:ascii="Arial" w:hAnsi="Arial"/>
       <w:color w:val="FFFFFF" w:themeColor="background1"/>
       <w14:textFill>
         <w14:solidFill>
@@ -15921,6 +16310,7 @@
       <w:spacing w:after="0" w:line="240" w:lineRule="auto"/>
     </w:pPr>
     <w:rPr>
+      <w:rFonts w:ascii="Arial" w:hAnsi="Arial"/>
       <w:color w:val="FFFFFF" w:themeColor="background1"/>
       <w14:textFill>
         <w14:solidFill>
@@ -16031,6 +16421,7 @@
       <w:spacing w:after="0" w:line="240" w:lineRule="auto"/>
     </w:pPr>
     <w:rPr>
+      <w:rFonts w:ascii="Arial" w:hAnsi="Arial"/>
       <w:color w:val="FFFFFF" w:themeColor="background1"/>
       <w14:textFill>
         <w14:solidFill>
@@ -16141,6 +16532,7 @@
       <w:spacing w:after="0" w:line="240" w:lineRule="auto"/>
     </w:pPr>
     <w:rPr>
+      <w:rFonts w:ascii="Arial" w:hAnsi="Arial"/>
       <w:color w:val="FFFFFF" w:themeColor="background1"/>
       <w14:textFill>
         <w14:solidFill>
@@ -16251,6 +16643,7 @@
       <w:spacing w:after="0" w:line="240" w:lineRule="auto"/>
     </w:pPr>
     <w:rPr>
+      <w:rFonts w:ascii="Arial" w:hAnsi="Arial"/>
       <w:color w:val="FFFFFF" w:themeColor="background1"/>
       <w14:textFill>
         <w14:solidFill>
@@ -16361,6 +16754,7 @@
       <w:spacing w:after="0" w:line="240" w:lineRule="auto"/>
     </w:pPr>
     <w:rPr>
+      <w:rFonts w:ascii="Arial" w:hAnsi="Arial"/>
       <w:color w:val="000000" w:themeColor="text1"/>
       <w14:textFill>
         <w14:solidFill>
@@ -16504,6 +16898,7 @@
       <w:spacing w:after="0" w:line="240" w:lineRule="auto"/>
     </w:pPr>
     <w:rPr>
+      <w:rFonts w:ascii="Arial" w:hAnsi="Arial"/>
       <w:color w:val="000000" w:themeColor="text1"/>
       <w14:textFill>
         <w14:solidFill>
@@ -16647,6 +17042,7 @@
       <w:spacing w:after="0" w:line="240" w:lineRule="auto"/>
     </w:pPr>
     <w:rPr>
+      <w:rFonts w:ascii="Arial" w:hAnsi="Arial"/>
       <w:color w:val="000000" w:themeColor="text1"/>
       <w14:textFill>
         <w14:solidFill>
@@ -16790,6 +17186,7 @@
       <w:spacing w:after="0" w:line="240" w:lineRule="auto"/>
     </w:pPr>
     <w:rPr>
+      <w:rFonts w:ascii="Arial" w:hAnsi="Arial"/>
       <w:color w:val="000000" w:themeColor="text1"/>
       <w14:textFill>
         <w14:solidFill>
@@ -16913,6 +17310,7 @@
       <w:spacing w:after="0" w:line="240" w:lineRule="auto"/>
     </w:pPr>
     <w:rPr>
+      <w:rFonts w:ascii="Arial" w:hAnsi="Arial"/>
       <w:color w:val="000000" w:themeColor="text1"/>
       <w14:textFill>
         <w14:solidFill>
@@ -17056,6 +17454,7 @@
       <w:spacing w:after="0" w:line="240" w:lineRule="auto"/>
     </w:pPr>
     <w:rPr>
+      <w:rFonts w:ascii="Arial" w:hAnsi="Arial"/>
       <w:color w:val="000000" w:themeColor="text1"/>
       <w14:textFill>
         <w14:solidFill>
@@ -17199,6 +17598,7 @@
       <w:spacing w:after="0" w:line="240" w:lineRule="auto"/>
     </w:pPr>
     <w:rPr>
+      <w:rFonts w:ascii="Arial" w:hAnsi="Arial"/>
       <w:color w:val="000000" w:themeColor="text1"/>
       <w14:textFill>
         <w14:solidFill>
@@ -17342,6 +17742,7 @@
       <w:spacing w:after="0" w:line="240" w:lineRule="auto"/>
     </w:pPr>
     <w:rPr>
+      <w:rFonts w:ascii="Arial" w:hAnsi="Arial"/>
       <w:color w:val="000000" w:themeColor="text1"/>
       <w14:textFill>
         <w14:solidFill>
@@ -17431,6 +17832,7 @@
       <w:spacing w:after="0" w:line="240" w:lineRule="auto"/>
     </w:pPr>
     <w:rPr>
+      <w:rFonts w:ascii="Arial" w:hAnsi="Arial"/>
       <w:color w:val="000000" w:themeColor="text1"/>
       <w14:textFill>
         <w14:solidFill>
@@ -17520,6 +17922,7 @@
       <w:spacing w:after="0" w:line="240" w:lineRule="auto"/>
     </w:pPr>
     <w:rPr>
+      <w:rFonts w:ascii="Arial" w:hAnsi="Arial"/>
       <w:color w:val="000000" w:themeColor="text1"/>
       <w14:textFill>
         <w14:solidFill>
@@ -17609,6 +18012,7 @@
       <w:spacing w:after="0" w:line="240" w:lineRule="auto"/>
     </w:pPr>
     <w:rPr>
+      <w:rFonts w:ascii="Arial" w:hAnsi="Arial"/>
       <w:color w:val="000000" w:themeColor="text1"/>
       <w14:textFill>
         <w14:solidFill>
@@ -17698,6 +18102,7 @@
       <w:spacing w:after="0" w:line="240" w:lineRule="auto"/>
     </w:pPr>
     <w:rPr>
+      <w:rFonts w:ascii="Arial" w:hAnsi="Arial"/>
       <w:color w:val="000000" w:themeColor="text1"/>
       <w14:textFill>
         <w14:solidFill>
@@ -17787,6 +18192,7 @@
       <w:spacing w:after="0" w:line="240" w:lineRule="auto"/>
     </w:pPr>
     <w:rPr>
+      <w:rFonts w:ascii="Arial" w:hAnsi="Arial"/>
       <w:color w:val="000000" w:themeColor="text1"/>
       <w14:textFill>
         <w14:solidFill>
@@ -17876,6 +18282,7 @@
       <w:spacing w:after="0" w:line="240" w:lineRule="auto"/>
     </w:pPr>
     <w:rPr>
+      <w:rFonts w:ascii="Arial" w:hAnsi="Arial"/>
       <w:color w:val="000000" w:themeColor="text1"/>
       <w14:textFill>
         <w14:solidFill>
@@ -17965,6 +18372,7 @@
       <w:spacing w:after="0" w:line="240" w:lineRule="auto"/>
     </w:pPr>
     <w:rPr>
+      <w:rFonts w:ascii="Arial" w:hAnsi="Arial"/>
       <w:color w:val="000000" w:themeColor="text1"/>
       <w14:textFill>
         <w14:solidFill>
@@ -18056,6 +18464,7 @@
       <w:spacing w:after="0" w:line="240" w:lineRule="auto"/>
     </w:pPr>
     <w:rPr>
+      <w:rFonts w:ascii="Arial" w:hAnsi="Arial"/>
       <w:color w:val="000000" w:themeColor="text1"/>
       <w14:textFill>
         <w14:solidFill>
@@ -18147,6 +18556,7 @@
       <w:spacing w:after="0" w:line="240" w:lineRule="auto"/>
     </w:pPr>
     <w:rPr>
+      <w:rFonts w:ascii="Arial" w:hAnsi="Arial"/>
       <w:color w:val="000000" w:themeColor="text1"/>
       <w14:textFill>
         <w14:solidFill>
@@ -18238,6 +18648,7 @@
       <w:spacing w:after="0" w:line="240" w:lineRule="auto"/>
     </w:pPr>
     <w:rPr>
+      <w:rFonts w:ascii="Arial" w:hAnsi="Arial"/>
       <w:color w:val="000000" w:themeColor="text1"/>
       <w14:textFill>
         <w14:solidFill>
@@ -18329,6 +18740,7 @@
       <w:spacing w:after="0" w:line="240" w:lineRule="auto"/>
     </w:pPr>
     <w:rPr>
+      <w:rFonts w:ascii="Arial" w:hAnsi="Arial"/>
       <w:color w:val="000000" w:themeColor="text1"/>
       <w14:textFill>
         <w14:solidFill>
@@ -18420,6 +18832,7 @@
       <w:spacing w:after="0" w:line="240" w:lineRule="auto"/>
     </w:pPr>
     <w:rPr>
+      <w:rFonts w:ascii="Arial" w:hAnsi="Arial"/>
       <w:color w:val="000000" w:themeColor="text1"/>
       <w14:textFill>
         <w14:solidFill>
@@ -18511,6 +18924,7 @@
       <w:spacing w:after="0" w:line="240" w:lineRule="auto"/>
     </w:pPr>
     <w:rPr>
+      <w:rFonts w:ascii="Arial" w:hAnsi="Arial"/>
       <w:color w:val="000000" w:themeColor="text1"/>
       <w14:textFill>
         <w14:solidFill>

</xml_diff>